<commit_message>
Revisi docx print preview RJD Perawat
</commit_message>
<xml_diff>
--- a/public/doc/emr/print_rajal_dewasa_perawat.docx
+++ b/public/doc/emr/print_rajal_dewasa_perawat.docx
@@ -41,7 +41,7 @@
                 <w:noProof/>
               </w:rPr>
               <w:drawing>
-                <wp:anchor distT="0" distB="0" distL="114300" distR="114300" simplePos="0" relativeHeight="251676672" behindDoc="0" locked="0" layoutInCell="1" allowOverlap="1" wp14:anchorId="3EB698E0" wp14:editId="65436259">
+                <wp:anchor distT="0" distB="0" distL="114300" distR="114300" simplePos="0" relativeHeight="251655168" behindDoc="0" locked="0" layoutInCell="1" allowOverlap="1" wp14:anchorId="3EB698E0" wp14:editId="20B4066B">
                   <wp:simplePos x="0" y="0"/>
                   <wp:positionH relativeFrom="column">
                     <wp:posOffset>-25400</wp:posOffset>
@@ -138,46 +138,21 @@
                 <w:b/>
                 <w:szCs w:val="16"/>
               </w:rPr>
-              <w:t xml:space="preserve">Jl. Mayor Sunaryo No.37, Jetis, </w:t>
-            </w:r>
-            <w:proofErr w:type="spellStart"/>
+              <w:t>Jl. Mayor Sunaryo No.37, Jetis, Sukoharjo 57512 Telp (0271) 593979</w:t>
+            </w:r>
+            <w:r>
+              <w:rPr>
+                <w:b/>
+                <w:sz w:val="22"/>
+              </w:rPr>
+              <w:br/>
+            </w:r>
             <w:r>
               <w:rPr>
                 <w:b/>
                 <w:szCs w:val="16"/>
               </w:rPr>
-              <w:t>Sukoharjo</w:t>
-            </w:r>
-            <w:proofErr w:type="spellEnd"/>
-            <w:r>
-              <w:rPr>
-                <w:b/>
-                <w:szCs w:val="16"/>
-              </w:rPr>
-              <w:t xml:space="preserve"> 57512 Telp (0271) 593979</w:t>
-            </w:r>
-            <w:r>
-              <w:rPr>
-                <w:b/>
-                <w:sz w:val="22"/>
-              </w:rPr>
-              <w:br/>
-            </w:r>
-            <w:proofErr w:type="gramStart"/>
-            <w:r>
-              <w:rPr>
-                <w:b/>
-                <w:szCs w:val="16"/>
-              </w:rPr>
-              <w:t>E-Mail :</w:t>
-            </w:r>
-            <w:proofErr w:type="gramEnd"/>
-            <w:r>
-              <w:rPr>
-                <w:b/>
-                <w:szCs w:val="16"/>
-              </w:rPr>
-              <w:t xml:space="preserve"> </w:t>
+              <w:t xml:space="preserve">E-Mail : </w:t>
             </w:r>
             <w:hyperlink r:id="rId9" w:history="1">
               <w:r>
@@ -196,23 +171,7 @@
                 <w:b/>
                 <w:szCs w:val="16"/>
               </w:rPr>
-              <w:t xml:space="preserve"> </w:t>
-            </w:r>
-            <w:proofErr w:type="gramStart"/>
-            <w:r>
-              <w:rPr>
-                <w:b/>
-                <w:szCs w:val="16"/>
-              </w:rPr>
-              <w:t>Website :</w:t>
-            </w:r>
-            <w:proofErr w:type="gramEnd"/>
-            <w:r>
-              <w:rPr>
-                <w:b/>
-                <w:szCs w:val="16"/>
-              </w:rPr>
-              <w:t xml:space="preserve"> </w:t>
+              <w:t xml:space="preserve"> Website : </w:t>
             </w:r>
             <w:hyperlink r:id="rId10" w:history="1">
               <w:r>
@@ -598,21 +557,14 @@
                 <w:lang w:val="en-ID"/>
               </w:rPr>
             </w:pPr>
-            <w:proofErr w:type="spellStart"/>
-            <w:proofErr w:type="gramStart"/>
             <w:r>
               <w:t>Tanggal</w:t>
             </w:r>
-            <w:proofErr w:type="spellEnd"/>
             <w:r>
               <w:t xml:space="preserve"> </w:t>
             </w:r>
             <w:r>
-              <w:t>:</w:t>
-            </w:r>
-            <w:proofErr w:type="gramEnd"/>
-            <w:r>
-              <w:t xml:space="preserve"> </w:t>
+              <w:t xml:space="preserve">: </w:t>
             </w:r>
             <w:r>
               <w:rPr>
@@ -654,7 +606,6 @@
                 <w:lang w:val="en-ID"/>
               </w:rPr>
             </w:pPr>
-            <w:proofErr w:type="gramStart"/>
             <w:r>
               <w:t>Jam</w:t>
             </w:r>
@@ -662,11 +613,7 @@
               <w:t xml:space="preserve"> </w:t>
             </w:r>
             <w:r>
-              <w:t>:</w:t>
-            </w:r>
-            <w:proofErr w:type="gramEnd"/>
-            <w:r>
-              <w:t xml:space="preserve"> </w:t>
+              <w:t xml:space="preserve">: </w:t>
             </w:r>
             <w:r>
               <w:rPr>
@@ -797,13 +744,8 @@
             <w:tcW w:w="2426" w:type="dxa"/>
           </w:tcPr>
           <w:p>
-            <w:proofErr w:type="spellStart"/>
-            <w:r>
-              <w:t>Keluhan</w:t>
-            </w:r>
-            <w:proofErr w:type="spellEnd"/>
-            <w:r>
-              <w:t xml:space="preserve"> Utama</w:t>
+            <w:r>
+              <w:t>Keluhan Utama</w:t>
             </w:r>
           </w:p>
         </w:tc>
@@ -848,21 +790,8 @@
           </w:tcPr>
           <w:p>
             <w:r>
-              <w:t xml:space="preserve">Riwayat </w:t>
-            </w:r>
-            <w:proofErr w:type="spellStart"/>
-            <w:r>
-              <w:t>Penyakit</w:t>
-            </w:r>
-            <w:proofErr w:type="spellEnd"/>
-            <w:r>
-              <w:t xml:space="preserve"> </w:t>
-            </w:r>
-            <w:proofErr w:type="spellStart"/>
-            <w:r>
-              <w:t>Sekarang</w:t>
-            </w:r>
-            <w:proofErr w:type="spellEnd"/>
+              <w:t>Riwayat Penyakit Sekarang</w:t>
+            </w:r>
           </w:p>
         </w:tc>
         <w:tc>
@@ -906,21 +835,8 @@
           </w:tcPr>
           <w:p>
             <w:r>
-              <w:t xml:space="preserve">Riwayat </w:t>
-            </w:r>
-            <w:proofErr w:type="spellStart"/>
-            <w:r>
-              <w:t>Penyakit</w:t>
-            </w:r>
-            <w:proofErr w:type="spellEnd"/>
-            <w:r>
-              <w:t xml:space="preserve"> </w:t>
-            </w:r>
-            <w:proofErr w:type="spellStart"/>
-            <w:r>
-              <w:t>Dahulu</w:t>
-            </w:r>
-            <w:proofErr w:type="spellEnd"/>
+              <w:t>Riwayat Penyakit Dahulu</w:t>
+            </w:r>
           </w:p>
         </w:tc>
         <w:tc>
@@ -964,21 +880,8 @@
           </w:tcPr>
           <w:p>
             <w:r>
-              <w:t xml:space="preserve">Riwayat </w:t>
-            </w:r>
-            <w:proofErr w:type="spellStart"/>
-            <w:r>
-              <w:t>Penyakit</w:t>
-            </w:r>
-            <w:proofErr w:type="spellEnd"/>
-            <w:r>
-              <w:t xml:space="preserve"> </w:t>
-            </w:r>
-            <w:proofErr w:type="spellStart"/>
-            <w:r>
-              <w:t>Keluarga</w:t>
-            </w:r>
-            <w:proofErr w:type="spellEnd"/>
+              <w:t>Riwayat Penyakit Keluarga</w:t>
+            </w:r>
           </w:p>
         </w:tc>
         <w:tc>
@@ -1046,13 +949,8 @@
             <w:tcW w:w="2802" w:type="dxa"/>
           </w:tcPr>
           <w:p>
-            <w:proofErr w:type="spellStart"/>
-            <w:r>
-              <w:t>Keadaan</w:t>
-            </w:r>
-            <w:proofErr w:type="spellEnd"/>
-            <w:r>
-              <w:t xml:space="preserve"> Umum</w:t>
+            <w:r>
+              <w:t>Keadaan Umum</w:t>
             </w:r>
           </w:p>
         </w:tc>
@@ -1087,13 +985,8 @@
             <w:tcW w:w="2802" w:type="dxa"/>
           </w:tcPr>
           <w:p>
-            <w:proofErr w:type="spellStart"/>
-            <w:r>
-              <w:t>Tekanan</w:t>
-            </w:r>
-            <w:proofErr w:type="spellEnd"/>
-            <w:r>
-              <w:t xml:space="preserve"> Darah</w:t>
+            <w:r>
+              <w:t>Tekanan Darah</w:t>
             </w:r>
           </w:p>
         </w:tc>
@@ -1133,13 +1026,8 @@
             <w:pPr>
               <w:ind w:right="-105"/>
             </w:pPr>
-            <w:proofErr w:type="spellStart"/>
-            <w:r>
-              <w:t>Saturasi</w:t>
-            </w:r>
-            <w:proofErr w:type="spellEnd"/>
-            <w:r>
-              <w:t xml:space="preserve"> O</w:t>
+            <w:r>
+              <w:t>Saturasi O</w:t>
             </w:r>
             <w:r>
               <w:rPr>
@@ -1180,13 +1068,8 @@
             <w:tcW w:w="2802" w:type="dxa"/>
           </w:tcPr>
           <w:p>
-            <w:proofErr w:type="spellStart"/>
-            <w:r>
-              <w:t>Frekuensi</w:t>
-            </w:r>
-            <w:proofErr w:type="spellEnd"/>
-            <w:r>
-              <w:t xml:space="preserve"> Nadi</w:t>
+            <w:r>
+              <w:t>Frekuensi Nadi</w:t>
             </w:r>
           </w:p>
         </w:tc>
@@ -1261,13 +1144,8 @@
             <w:tcW w:w="2802" w:type="dxa"/>
           </w:tcPr>
           <w:p>
-            <w:proofErr w:type="spellStart"/>
-            <w:r>
-              <w:t>Frekuensi</w:t>
-            </w:r>
-            <w:proofErr w:type="spellEnd"/>
-            <w:r>
-              <w:t xml:space="preserve"> Nafas</w:t>
+            <w:r>
+              <w:t>Frekuensi Nafas</w:t>
             </w:r>
           </w:p>
         </w:tc>
@@ -1342,11 +1220,9 @@
             <w:tcW w:w="2802" w:type="dxa"/>
           </w:tcPr>
           <w:p>
-            <w:proofErr w:type="spellStart"/>
             <w:r>
               <w:t>Suhu</w:t>
             </w:r>
-            <w:proofErr w:type="spellEnd"/>
           </w:p>
         </w:tc>
         <w:tc>
@@ -1410,6 +1286,812 @@
                 <w:sz w:val="17"/>
               </w:rPr>
               <w:t>${IMT}</w:t>
+            </w:r>
+          </w:p>
+        </w:tc>
+      </w:tr>
+    </w:tbl>
+    <w:p/>
+    <w:p/>
+    <w:tbl>
+      <w:tblPr>
+        <w:tblStyle w:val="TableGrid"/>
+        <w:tblW w:w="0" w:type="auto"/>
+        <w:tblLook w:val="04A0" w:firstRow="1" w:lastRow="0" w:firstColumn="1" w:lastColumn="0" w:noHBand="0" w:noVBand="1"/>
+      </w:tblPr>
+      <w:tblGrid>
+        <w:gridCol w:w="11307"/>
+      </w:tblGrid>
+      <w:tr>
+        <w:tc>
+          <w:tcPr>
+            <w:tcW w:w="11307" w:type="dxa"/>
+          </w:tcPr>
+          <w:p>
+            <w:pPr>
+              <w:rPr>
+                <w:b/>
+                <w:bCs/>
+                <w:sz w:val="20"/>
+                <w:szCs w:val="20"/>
+                <w:lang w:val="en-ID"/>
+              </w:rPr>
+            </w:pPr>
+            <w:r>
+              <w:rPr>
+                <w:b/>
+                <w:bCs/>
+                <w:sz w:val="20"/>
+                <w:szCs w:val="20"/>
+                <w:lang w:val="en-ID"/>
+              </w:rPr>
+              <w:t>PSIKOLOGI - SOSIAL - EKONOMI - SPIRITUAL - FUNGSIONAL</w:t>
+            </w:r>
+          </w:p>
+        </w:tc>
+      </w:tr>
+      <w:tr>
+        <w:tc>
+          <w:tcPr>
+            <w:tcW w:w="11307" w:type="dxa"/>
+          </w:tcPr>
+          <w:p>
+            <w:pPr>
+              <w:rPr>
+                <w:lang w:val="en-ID"/>
+              </w:rPr>
+            </w:pPr>
+            <w:r>
+              <w:t>${</w:t>
+            </w:r>
+            <w:r>
+              <w:rPr>
+                <w:lang w:val="en-ID"/>
+              </w:rPr>
+              <w:t>PSIKOLOGI_SOSIAL_EKONOMI_SPIRITUAL</w:t>
+            </w:r>
+            <w:r>
+              <w:t>}</w:t>
+            </w:r>
+            <w:r>
+              <w:br/>
+            </w:r>
+            <w:r>
+              <w:t>${</w:t>
+            </w:r>
+            <w:r>
+              <w:t>STATUS_FUNGSIONAL</w:t>
+            </w:r>
+            <w:r>
+              <w:t>}</w:t>
+            </w:r>
+          </w:p>
+        </w:tc>
+      </w:tr>
+      <w:tr>
+        <w:tc>
+          <w:tcPr>
+            <w:tcW w:w="11307" w:type="dxa"/>
+          </w:tcPr>
+          <w:p>
+            <w:pPr>
+              <w:rPr>
+                <w:b/>
+                <w:bCs/>
+                <w:sz w:val="17"/>
+                <w:lang w:val="en-ID"/>
+              </w:rPr>
+            </w:pPr>
+            <w:r>
+              <w:rPr>
+                <w:b/>
+                <w:bCs/>
+                <w:sz w:val="20"/>
+                <w:szCs w:val="20"/>
+                <w:lang w:val="en-ID"/>
+              </w:rPr>
+              <w:t>SKRINING NYERI</w:t>
+            </w:r>
+          </w:p>
+        </w:tc>
+      </w:tr>
+      <w:tr>
+        <w:tc>
+          <w:tcPr>
+            <w:tcW w:w="11307" w:type="dxa"/>
+          </w:tcPr>
+          <w:p>
+            <w:pPr>
+              <w:rPr>
+                <w:sz w:val="17"/>
+                <w:lang w:val="en-ID"/>
+              </w:rPr>
+            </w:pPr>
+            <w:r>
+              <w:rPr>
+                <w:sz w:val="17"/>
+              </w:rPr>
+              <w:t>${</w:t>
+            </w:r>
+            <w:r>
+              <w:rPr>
+                <w:sz w:val="17"/>
+                <w:lang w:val="en-ID"/>
+              </w:rPr>
+              <w:t>SKRINING_NYERI</w:t>
+            </w:r>
+            <w:r>
+              <w:rPr>
+                <w:sz w:val="17"/>
+                <w:lang w:val="en-ID"/>
+              </w:rPr>
+              <w:t>}</w:t>
+            </w:r>
+          </w:p>
+        </w:tc>
+      </w:tr>
+      <w:tr>
+        <w:tc>
+          <w:tcPr>
+            <w:tcW w:w="11307" w:type="dxa"/>
+          </w:tcPr>
+          <w:p>
+            <w:pPr>
+              <w:rPr>
+                <w:sz w:val="17"/>
+              </w:rPr>
+            </w:pPr>
+            <w:r>
+              <w:rPr>
+                <w:b/>
+                <w:bCs/>
+                <w:sz w:val="20"/>
+                <w:szCs w:val="20"/>
+              </w:rPr>
+              <w:t>SKRINING RISIKO JATUH</w:t>
+            </w:r>
+          </w:p>
+        </w:tc>
+      </w:tr>
+      <w:tr>
+        <w:tc>
+          <w:tcPr>
+            <w:tcW w:w="11307" w:type="dxa"/>
+          </w:tcPr>
+          <w:p>
+            <w:pPr>
+              <w:rPr>
+                <w:lang w:val="en-ID"/>
+              </w:rPr>
+            </w:pPr>
+            <w:r>
+              <w:t>${</w:t>
+            </w:r>
+            <w:r>
+              <w:rPr>
+                <w:lang w:val="en-ID"/>
+              </w:rPr>
+              <w:t>SKRINING_RISIKO_JATUH</w:t>
+            </w:r>
+            <w:r>
+              <w:rPr>
+                <w:lang w:val="en-ID"/>
+              </w:rPr>
+              <w:t>}</w:t>
+            </w:r>
+          </w:p>
+        </w:tc>
+      </w:tr>
+      <w:tr>
+        <w:tc>
+          <w:tcPr>
+            <w:tcW w:w="11307" w:type="dxa"/>
+          </w:tcPr>
+          <w:p>
+            <w:pPr>
+              <w:rPr>
+                <w:sz w:val="17"/>
+              </w:rPr>
+            </w:pPr>
+            <w:r>
+              <w:rPr>
+                <w:b/>
+                <w:bCs/>
+                <w:sz w:val="20"/>
+                <w:szCs w:val="20"/>
+              </w:rPr>
+              <w:t>SKRINING GIZI</w:t>
+            </w:r>
+          </w:p>
+        </w:tc>
+      </w:tr>
+      <w:tr>
+        <w:tc>
+          <w:tcPr>
+            <w:tcW w:w="11307" w:type="dxa"/>
+          </w:tcPr>
+          <w:p>
+            <w:pPr>
+              <w:rPr>
+                <w:lang w:val="en-ID"/>
+              </w:rPr>
+            </w:pPr>
+            <w:r>
+              <w:t>${</w:t>
+            </w:r>
+            <w:r>
+              <w:rPr>
+                <w:lang w:val="en-ID"/>
+              </w:rPr>
+              <w:t>SKRINING_</w:t>
+            </w:r>
+            <w:r>
+              <w:rPr>
+                <w:lang w:val="en-ID"/>
+              </w:rPr>
+              <w:t>GIZI}</w:t>
+            </w:r>
+          </w:p>
+        </w:tc>
+      </w:tr>
+    </w:tbl>
+    <w:p/>
+    <w:tbl>
+      <w:tblPr>
+        <w:tblStyle w:val="TableGrid"/>
+        <w:tblW w:w="0" w:type="auto"/>
+        <w:tblLook w:val="04A0" w:firstRow="1" w:lastRow="0" w:firstColumn="1" w:lastColumn="0" w:noHBand="0" w:noVBand="1"/>
+      </w:tblPr>
+      <w:tblGrid>
+        <w:gridCol w:w="3769"/>
+        <w:gridCol w:w="3769"/>
+        <w:gridCol w:w="3769"/>
+      </w:tblGrid>
+      <w:tr>
+        <w:tc>
+          <w:tcPr>
+            <w:tcW w:w="11307" w:type="dxa"/>
+            <w:gridSpan w:val="3"/>
+          </w:tcPr>
+          <w:p>
+            <w:pPr>
+              <w:rPr>
+                <w:sz w:val="17"/>
+              </w:rPr>
+            </w:pPr>
+            <w:r>
+              <w:rPr>
+                <w:b/>
+                <w:bCs/>
+                <w:sz w:val="20"/>
+                <w:szCs w:val="20"/>
+              </w:rPr>
+              <w:t>EDUKASI</w:t>
+            </w:r>
+          </w:p>
+        </w:tc>
+      </w:tr>
+      <w:tr>
+        <w:tc>
+          <w:tcPr>
+            <w:tcW w:w="11307" w:type="dxa"/>
+            <w:gridSpan w:val="3"/>
+          </w:tcPr>
+          <w:p>
+            <w:pPr>
+              <w:rPr>
+                <w:b/>
+                <w:bCs/>
+                <w:sz w:val="20"/>
+                <w:szCs w:val="20"/>
+              </w:rPr>
+            </w:pPr>
+            <w:r>
+              <w:t>${</w:t>
+            </w:r>
+            <w:r>
+              <w:t>KESEDIAAN_DAN_HAMBATAN</w:t>
+            </w:r>
+            <w:r>
+              <w:rPr>
+                <w:lang w:val="en-ID"/>
+              </w:rPr>
+              <w:t>}</w:t>
+            </w:r>
+          </w:p>
+        </w:tc>
+      </w:tr>
+      <w:tr>
+        <w:tc>
+          <w:tcPr>
+            <w:tcW w:w="11307" w:type="dxa"/>
+            <w:gridSpan w:val="3"/>
+          </w:tcPr>
+          <w:p>
+            <w:pPr>
+              <w:rPr>
+                <w:b/>
+                <w:bCs/>
+                <w:sz w:val="20"/>
+                <w:szCs w:val="20"/>
+              </w:rPr>
+            </w:pPr>
+            <w:r>
+              <w:rPr>
+                <w:b/>
+                <w:bCs/>
+                <w:sz w:val="20"/>
+                <w:szCs w:val="20"/>
+              </w:rPr>
+              <w:t>Kebutuhan Edukasi</w:t>
+            </w:r>
+          </w:p>
+        </w:tc>
+      </w:tr>
+      <w:tr>
+        <w:tc>
+          <w:tcPr>
+            <w:tcW w:w="3769" w:type="dxa"/>
+          </w:tcPr>
+          <w:p>
+            <w:pPr>
+              <w:rPr>
+                <w:lang w:val="en-ID"/>
+              </w:rPr>
+            </w:pPr>
+            <w:r>
+              <w:t>${</w:t>
+            </w:r>
+            <w:r>
+              <w:rPr>
+                <w:lang w:val="en-ID"/>
+              </w:rPr>
+              <w:t>KEBUTUHAN_EDUKASI</w:t>
+            </w:r>
+            <w:r>
+              <w:rPr>
+                <w:lang w:val="en-ID"/>
+              </w:rPr>
+              <w:t>_1</w:t>
+            </w:r>
+            <w:r>
+              <w:rPr>
+                <w:lang w:val="en-ID"/>
+              </w:rPr>
+              <w:t>}</w:t>
+            </w:r>
+          </w:p>
+        </w:tc>
+        <w:tc>
+          <w:tcPr>
+            <w:tcW w:w="3769" w:type="dxa"/>
+          </w:tcPr>
+          <w:p>
+            <w:pPr>
+              <w:rPr>
+                <w:lang w:val="en-ID"/>
+              </w:rPr>
+            </w:pPr>
+            <w:r>
+              <w:t>${</w:t>
+            </w:r>
+            <w:r>
+              <w:rPr>
+                <w:lang w:val="en-ID"/>
+              </w:rPr>
+              <w:t>KEBUTUHAN_EDUKASI_</w:t>
+            </w:r>
+            <w:r>
+              <w:rPr>
+                <w:lang w:val="en-ID"/>
+              </w:rPr>
+              <w:t>2</w:t>
+            </w:r>
+            <w:r>
+              <w:rPr>
+                <w:lang w:val="en-ID"/>
+              </w:rPr>
+              <w:t>}</w:t>
+            </w:r>
+          </w:p>
+        </w:tc>
+        <w:tc>
+          <w:tcPr>
+            <w:tcW w:w="3769" w:type="dxa"/>
+          </w:tcPr>
+          <w:p>
+            <w:pPr>
+              <w:rPr>
+                <w:lang w:val="en-ID"/>
+              </w:rPr>
+            </w:pPr>
+            <w:r>
+              <w:t>${</w:t>
+            </w:r>
+            <w:r>
+              <w:rPr>
+                <w:lang w:val="en-ID"/>
+              </w:rPr>
+              <w:t>KEBUTUHAN_EDUKASI_</w:t>
+            </w:r>
+            <w:r>
+              <w:rPr>
+                <w:lang w:val="en-ID"/>
+              </w:rPr>
+              <w:t>3</w:t>
+            </w:r>
+            <w:r>
+              <w:rPr>
+                <w:lang w:val="en-ID"/>
+              </w:rPr>
+              <w:t>}</w:t>
+            </w:r>
+          </w:p>
+        </w:tc>
+      </w:tr>
+      <w:tr>
+        <w:tc>
+          <w:tcPr>
+            <w:tcW w:w="11307" w:type="dxa"/>
+            <w:gridSpan w:val="3"/>
+          </w:tcPr>
+          <w:p>
+            <w:pPr>
+              <w:rPr>
+                <w:sz w:val="17"/>
+              </w:rPr>
+            </w:pPr>
+            <w:r>
+              <w:rPr>
+                <w:b/>
+                <w:bCs/>
+                <w:sz w:val="20"/>
+                <w:szCs w:val="20"/>
+              </w:rPr>
+              <w:t>MASALAH KEPERAWATAN</w:t>
+            </w:r>
+          </w:p>
+        </w:tc>
+      </w:tr>
+      <w:tr>
+        <w:tc>
+          <w:tcPr>
+            <w:tcW w:w="3769" w:type="dxa"/>
+          </w:tcPr>
+          <w:p>
+            <w:pPr>
+              <w:rPr>
+                <w:lang w:val="en-ID"/>
+              </w:rPr>
+            </w:pPr>
+            <w:r>
+              <w:t>${</w:t>
+            </w:r>
+            <w:r>
+              <w:rPr>
+                <w:lang w:val="en-ID"/>
+              </w:rPr>
+              <w:t>MASALAH_KEPERAWATAN</w:t>
+            </w:r>
+            <w:r>
+              <w:rPr>
+                <w:lang w:val="en-ID"/>
+              </w:rPr>
+              <w:t>_1</w:t>
+            </w:r>
+            <w:r>
+              <w:rPr>
+                <w:lang w:val="en-ID"/>
+              </w:rPr>
+              <w:t>}</w:t>
+            </w:r>
+          </w:p>
+        </w:tc>
+        <w:tc>
+          <w:tcPr>
+            <w:tcW w:w="3769" w:type="dxa"/>
+          </w:tcPr>
+          <w:p>
+            <w:pPr>
+              <w:rPr>
+                <w:lang w:val="en-ID"/>
+              </w:rPr>
+            </w:pPr>
+            <w:r>
+              <w:t>${</w:t>
+            </w:r>
+            <w:r>
+              <w:rPr>
+                <w:lang w:val="en-ID"/>
+              </w:rPr>
+              <w:t>MASALAH_KEPERAWATAN_</w:t>
+            </w:r>
+            <w:r>
+              <w:rPr>
+                <w:lang w:val="en-ID"/>
+              </w:rPr>
+              <w:t>2</w:t>
+            </w:r>
+            <w:r>
+              <w:rPr>
+                <w:lang w:val="en-ID"/>
+              </w:rPr>
+              <w:t>}</w:t>
+            </w:r>
+          </w:p>
+        </w:tc>
+        <w:tc>
+          <w:tcPr>
+            <w:tcW w:w="3769" w:type="dxa"/>
+          </w:tcPr>
+          <w:p>
+            <w:pPr>
+              <w:rPr>
+                <w:lang w:val="en-ID"/>
+              </w:rPr>
+            </w:pPr>
+            <w:r>
+              <w:t>${</w:t>
+            </w:r>
+            <w:r>
+              <w:rPr>
+                <w:lang w:val="en-ID"/>
+              </w:rPr>
+              <w:t>MASALAH_KEPERAWATAN_</w:t>
+            </w:r>
+            <w:r>
+              <w:rPr>
+                <w:lang w:val="en-ID"/>
+              </w:rPr>
+              <w:t>3</w:t>
+            </w:r>
+            <w:r>
+              <w:rPr>
+                <w:lang w:val="en-ID"/>
+              </w:rPr>
+              <w:t>}</w:t>
+            </w:r>
+          </w:p>
+        </w:tc>
+      </w:tr>
+    </w:tbl>
+    <w:p/>
+    <w:tbl>
+      <w:tblPr>
+        <w:tblStyle w:val="TableGrid"/>
+        <w:tblW w:w="0" w:type="auto"/>
+        <w:tblLook w:val="04A0" w:firstRow="1" w:lastRow="0" w:firstColumn="1" w:lastColumn="0" w:noHBand="0" w:noVBand="1"/>
+      </w:tblPr>
+      <w:tblGrid>
+        <w:gridCol w:w="5653"/>
+        <w:gridCol w:w="5654"/>
+      </w:tblGrid>
+      <w:tr>
+        <w:tc>
+          <w:tcPr>
+            <w:tcW w:w="11307" w:type="dxa"/>
+            <w:gridSpan w:val="2"/>
+          </w:tcPr>
+          <w:p>
+            <w:pPr>
+              <w:rPr>
+                <w:b/>
+                <w:bCs/>
+                <w:sz w:val="20"/>
+                <w:szCs w:val="20"/>
+                <w:lang w:val="en-ID"/>
+              </w:rPr>
+            </w:pPr>
+            <w:r>
+              <w:rPr>
+                <w:b/>
+                <w:bCs/>
+                <w:sz w:val="20"/>
+                <w:szCs w:val="20"/>
+                <w:lang w:val="en-ID"/>
+              </w:rPr>
+              <w:t>PERENCANAAN DAN TINDAKAN</w:t>
+            </w:r>
+          </w:p>
+        </w:tc>
+      </w:tr>
+      <w:tr>
+        <w:tc>
+          <w:tcPr>
+            <w:tcW w:w="5653" w:type="dxa"/>
+          </w:tcPr>
+          <w:p>
+            <w:pPr>
+              <w:rPr>
+                <w:b/>
+                <w:bCs/>
+                <w:lang w:val="en-ID"/>
+              </w:rPr>
+            </w:pPr>
+            <w:r>
+              <w:rPr>
+                <w:b/>
+                <w:bCs/>
+              </w:rPr>
+              <w:t>Mandiri</w:t>
+            </w:r>
+          </w:p>
+        </w:tc>
+        <w:tc>
+          <w:tcPr>
+            <w:tcW w:w="5654" w:type="dxa"/>
+          </w:tcPr>
+          <w:p>
+            <w:pPr>
+              <w:rPr>
+                <w:b/>
+                <w:bCs/>
+                <w:lang w:val="en-ID"/>
+              </w:rPr>
+            </w:pPr>
+            <w:r>
+              <w:rPr>
+                <w:b/>
+                <w:bCs/>
+                <w:lang w:val="en-ID"/>
+              </w:rPr>
+              <w:t>Kolaborasi</w:t>
+            </w:r>
+          </w:p>
+        </w:tc>
+      </w:tr>
+      <w:tr>
+        <w:trPr>
+          <w:trHeight w:val="269"/>
+        </w:trPr>
+        <w:tc>
+          <w:tcPr>
+            <w:tcW w:w="5653" w:type="dxa"/>
+            <w:vMerge w:val="restart"/>
+          </w:tcPr>
+          <w:p>
+            <w:pPr>
+              <w:rPr>
+                <w:sz w:val="17"/>
+                <w:lang w:val="en-ID"/>
+              </w:rPr>
+            </w:pPr>
+            <w:r>
+              <w:t>${</w:t>
+            </w:r>
+            <w:r>
+              <w:rPr>
+                <w:lang w:val="en-ID"/>
+              </w:rPr>
+              <w:t>TINDAKAN</w:t>
+            </w:r>
+            <w:r>
+              <w:rPr>
+                <w:lang w:val="en-ID"/>
+              </w:rPr>
+              <w:t>}</w:t>
+            </w:r>
+          </w:p>
+        </w:tc>
+        <w:tc>
+          <w:tcPr>
+            <w:tcW w:w="5654" w:type="dxa"/>
+          </w:tcPr>
+          <w:p>
+            <w:pPr>
+              <w:rPr>
+                <w:sz w:val="17"/>
+                <w:lang w:val="en-ID"/>
+              </w:rPr>
+            </w:pPr>
+            <w:r>
+              <w:t>${</w:t>
+            </w:r>
+            <w:r>
+              <w:rPr>
+                <w:lang w:val="en-ID"/>
+              </w:rPr>
+              <w:t>RAWAT_LUKA</w:t>
+            </w:r>
+            <w:r>
+              <w:rPr>
+                <w:lang w:val="en-ID"/>
+              </w:rPr>
+              <w:t>}</w:t>
+            </w:r>
+          </w:p>
+        </w:tc>
+      </w:tr>
+      <w:tr>
+        <w:trPr>
+          <w:trHeight w:val="269"/>
+        </w:trPr>
+        <w:tc>
+          <w:tcPr>
+            <w:tcW w:w="5653" w:type="dxa"/>
+            <w:vMerge/>
+          </w:tcPr>
+          <w:p>
+            <w:pPr>
+              <w:ind w:left="426"/>
+              <w:rPr>
+                <w:noProof/>
+              </w:rPr>
+            </w:pPr>
+          </w:p>
+        </w:tc>
+        <w:tc>
+          <w:tcPr>
+            <w:tcW w:w="5654" w:type="dxa"/>
+          </w:tcPr>
+          <w:p>
+            <w:pPr>
+              <w:rPr>
+                <w:b/>
+                <w:bCs/>
+                <w:noProof/>
+                <w:sz w:val="17"/>
+                <w:lang w:val="en-ID"/>
+              </w:rPr>
+            </w:pPr>
+            <w:r>
+              <w:rPr>
+                <w:b/>
+                <w:bCs/>
+                <w:noProof/>
+                <w:sz w:val="17"/>
+                <w:lang w:val="en-ID"/>
+              </w:rPr>
+              <w:t>Pemberian Terapi</w:t>
+            </w:r>
+          </w:p>
+        </w:tc>
+      </w:tr>
+      <w:tr>
+        <w:trPr>
+          <w:trHeight w:val="269"/>
+        </w:trPr>
+        <w:tc>
+          <w:tcPr>
+            <w:tcW w:w="5653" w:type="dxa"/>
+            <w:vMerge/>
+          </w:tcPr>
+          <w:p>
+            <w:pPr>
+              <w:ind w:left="426"/>
+              <w:rPr>
+                <w:noProof/>
+              </w:rPr>
+            </w:pPr>
+          </w:p>
+        </w:tc>
+        <w:tc>
+          <w:tcPr>
+            <w:tcW w:w="5654" w:type="dxa"/>
+            <w:vAlign w:val="center"/>
+          </w:tcPr>
+          <w:p>
+            <w:pPr>
+              <w:rPr>
+                <w:noProof/>
+                <w:sz w:val="17"/>
+                <w:lang w:val="en-ID"/>
+              </w:rPr>
+            </w:pPr>
+            <w:r>
+              <w:t>${</w:t>
+            </w:r>
+            <w:r>
+              <w:rPr>
+                <w:lang w:val="en-ID"/>
+              </w:rPr>
+              <w:t>TERAPI</w:t>
+            </w:r>
+            <w:r>
+              <w:rPr>
+                <w:lang w:val="en-ID"/>
+              </w:rPr>
+              <w:t>}</w:t>
             </w:r>
           </w:p>
         </w:tc>
@@ -1433,22 +2115,17 @@
           <w:p>
             <w:pPr>
               <w:rPr>
+                <w:sz w:val="17"/>
+              </w:rPr>
+            </w:pPr>
+            <w:r>
+              <w:rPr>
                 <w:b/>
                 <w:bCs/>
                 <w:sz w:val="20"/>
                 <w:szCs w:val="20"/>
-                <w:lang w:val="en-ID"/>
-              </w:rPr>
-            </w:pPr>
-            <w:r>
-              <w:rPr>
-                <w:b/>
-                <w:bCs/>
-                <w:sz w:val="20"/>
-                <w:szCs w:val="20"/>
-                <w:lang w:val="en-ID"/>
-              </w:rPr>
-              <w:t>PSIKOLOGI - SOSIAL - EKONOMI - SPIRITUAL - FUNGSIONAL</w:t>
+              </w:rPr>
+              <w:t>RENCANA ASUHAN KEPERAWATAN</w:t>
             </w:r>
           </w:p>
         </w:tc>
@@ -1471,431 +2148,7 @@
               <w:rPr>
                 <w:lang w:val="en-ID"/>
               </w:rPr>
-              <w:t>PSIKOLOGI_SOSIAL_EKONOMI_SPIRITUAL</w:t>
-            </w:r>
-            <w:r>
-              <w:t>}</w:t>
-            </w:r>
-            <w:r>
-              <w:br/>
-            </w:r>
-            <w:r>
-              <w:t>${</w:t>
-            </w:r>
-            <w:r>
-              <w:t>STATUS_FUNGSIONAL</w:t>
-            </w:r>
-            <w:r>
-              <w:t>}</w:t>
-            </w:r>
-          </w:p>
-        </w:tc>
-      </w:tr>
-      <w:tr>
-        <w:tc>
-          <w:tcPr>
-            <w:tcW w:w="11307" w:type="dxa"/>
-          </w:tcPr>
-          <w:p>
-            <w:pPr>
-              <w:rPr>
-                <w:b/>
-                <w:bCs/>
-                <w:sz w:val="17"/>
-                <w:lang w:val="en-ID"/>
-              </w:rPr>
-            </w:pPr>
-            <w:r>
-              <w:rPr>
-                <w:b/>
-                <w:bCs/>
-                <w:sz w:val="20"/>
-                <w:szCs w:val="20"/>
-                <w:lang w:val="en-ID"/>
-              </w:rPr>
-              <w:t>SKRINING</w:t>
-            </w:r>
-            <w:r>
-              <w:rPr>
-                <w:b/>
-                <w:bCs/>
-                <w:sz w:val="20"/>
-                <w:szCs w:val="20"/>
-                <w:lang w:val="en-ID"/>
-              </w:rPr>
-              <w:t xml:space="preserve"> </w:t>
-            </w:r>
-            <w:r>
-              <w:rPr>
-                <w:b/>
-                <w:bCs/>
-                <w:sz w:val="20"/>
-                <w:szCs w:val="20"/>
-                <w:lang w:val="en-ID"/>
-              </w:rPr>
-              <w:t>NYERI</w:t>
-            </w:r>
-          </w:p>
-        </w:tc>
-      </w:tr>
-      <w:tr>
-        <w:tc>
-          <w:tcPr>
-            <w:tcW w:w="11307" w:type="dxa"/>
-          </w:tcPr>
-          <w:p>
-            <w:pPr>
-              <w:rPr>
-                <w:sz w:val="17"/>
-                <w:lang w:val="en-ID"/>
-              </w:rPr>
-            </w:pPr>
-            <w:r>
-              <w:rPr>
-                <w:sz w:val="17"/>
-              </w:rPr>
-              <w:t>${</w:t>
-            </w:r>
-            <w:r>
-              <w:rPr>
-                <w:sz w:val="17"/>
-                <w:lang w:val="en-ID"/>
-              </w:rPr>
-              <w:t>SKRINING_NYERI</w:t>
-            </w:r>
-            <w:r>
-              <w:rPr>
-                <w:sz w:val="17"/>
-                <w:lang w:val="en-ID"/>
-              </w:rPr>
-              <w:t>}</w:t>
-            </w:r>
-          </w:p>
-        </w:tc>
-      </w:tr>
-      <w:tr>
-        <w:tc>
-          <w:tcPr>
-            <w:tcW w:w="11307" w:type="dxa"/>
-          </w:tcPr>
-          <w:p>
-            <w:pPr>
-              <w:rPr>
-                <w:sz w:val="17"/>
-              </w:rPr>
-            </w:pPr>
-            <w:r>
-              <w:rPr>
-                <w:b/>
-                <w:bCs/>
-                <w:sz w:val="20"/>
-                <w:szCs w:val="20"/>
-              </w:rPr>
-              <w:t>SKRINING RISIKO JATUH</w:t>
-            </w:r>
-          </w:p>
-        </w:tc>
-      </w:tr>
-      <w:tr>
-        <w:tc>
-          <w:tcPr>
-            <w:tcW w:w="11307" w:type="dxa"/>
-          </w:tcPr>
-          <w:p>
-            <w:pPr>
-              <w:rPr>
-                <w:lang w:val="en-ID"/>
-              </w:rPr>
-            </w:pPr>
-            <w:r>
-              <w:t>${</w:t>
-            </w:r>
-            <w:r>
-              <w:rPr>
-                <w:lang w:val="en-ID"/>
-              </w:rPr>
-              <w:t>SKRINING_RISIKO_JATUH</w:t>
-            </w:r>
-            <w:r>
-              <w:rPr>
-                <w:lang w:val="en-ID"/>
-              </w:rPr>
-              <w:t>}</w:t>
-            </w:r>
-          </w:p>
-        </w:tc>
-      </w:tr>
-      <w:tr>
-        <w:tc>
-          <w:tcPr>
-            <w:tcW w:w="11307" w:type="dxa"/>
-          </w:tcPr>
-          <w:p>
-            <w:pPr>
-              <w:rPr>
-                <w:sz w:val="17"/>
-              </w:rPr>
-            </w:pPr>
-            <w:r>
-              <w:rPr>
-                <w:b/>
-                <w:bCs/>
-                <w:sz w:val="20"/>
-                <w:szCs w:val="20"/>
-              </w:rPr>
-              <w:t xml:space="preserve">SKRINING </w:t>
-            </w:r>
-            <w:r>
-              <w:rPr>
-                <w:b/>
-                <w:bCs/>
-                <w:sz w:val="20"/>
-                <w:szCs w:val="20"/>
-              </w:rPr>
-              <w:t>GIZI</w:t>
-            </w:r>
-          </w:p>
-        </w:tc>
-      </w:tr>
-      <w:tr>
-        <w:tc>
-          <w:tcPr>
-            <w:tcW w:w="11307" w:type="dxa"/>
-          </w:tcPr>
-          <w:p>
-            <w:pPr>
-              <w:rPr>
-                <w:lang w:val="en-ID"/>
-              </w:rPr>
-            </w:pPr>
-            <w:r>
-              <w:t>${</w:t>
-            </w:r>
-            <w:r>
-              <w:rPr>
-                <w:lang w:val="en-ID"/>
-              </w:rPr>
-              <w:t>SKRINING_</w:t>
-            </w:r>
-            <w:r>
-              <w:rPr>
-                <w:lang w:val="en-ID"/>
-              </w:rPr>
-              <w:t>GIZI</w:t>
-            </w:r>
-            <w:r>
-              <w:rPr>
-                <w:lang w:val="en-ID"/>
-              </w:rPr>
-              <w:t>}</w:t>
-            </w:r>
-          </w:p>
-        </w:tc>
-      </w:tr>
-      <w:tr>
-        <w:tc>
-          <w:tcPr>
-            <w:tcW w:w="11307" w:type="dxa"/>
-          </w:tcPr>
-          <w:p>
-            <w:pPr>
-              <w:rPr>
-                <w:sz w:val="17"/>
-              </w:rPr>
-            </w:pPr>
-            <w:r>
-              <w:rPr>
-                <w:b/>
-                <w:bCs/>
-                <w:sz w:val="20"/>
-                <w:szCs w:val="20"/>
-              </w:rPr>
-              <w:t>KEBUTUHAN EDUKASI</w:t>
-            </w:r>
-          </w:p>
-        </w:tc>
-      </w:tr>
-      <w:tr>
-        <w:tc>
-          <w:tcPr>
-            <w:tcW w:w="11307" w:type="dxa"/>
-          </w:tcPr>
-          <w:p>
-            <w:pPr>
-              <w:rPr>
-                <w:lang w:val="en-ID"/>
-              </w:rPr>
-            </w:pPr>
-            <w:r>
-              <w:t>${</w:t>
-            </w:r>
-            <w:r>
-              <w:rPr>
-                <w:lang w:val="en-ID"/>
-              </w:rPr>
-              <w:t>KEBUTUHAN_EDUKASI</w:t>
-            </w:r>
-            <w:r>
-              <w:rPr>
-                <w:lang w:val="en-ID"/>
-              </w:rPr>
-              <w:t>}</w:t>
-            </w:r>
-          </w:p>
-        </w:tc>
-      </w:tr>
-      <w:tr>
-        <w:tc>
-          <w:tcPr>
-            <w:tcW w:w="11307" w:type="dxa"/>
-          </w:tcPr>
-          <w:p>
-            <w:pPr>
-              <w:rPr>
-                <w:sz w:val="17"/>
-              </w:rPr>
-            </w:pPr>
-            <w:r>
-              <w:rPr>
-                <w:b/>
-                <w:bCs/>
-                <w:sz w:val="20"/>
-                <w:szCs w:val="20"/>
-              </w:rPr>
-              <w:t>MASALAH KEPERAWATAN</w:t>
-            </w:r>
-          </w:p>
-        </w:tc>
-      </w:tr>
-      <w:tr>
-        <w:tc>
-          <w:tcPr>
-            <w:tcW w:w="11307" w:type="dxa"/>
-          </w:tcPr>
-          <w:p>
-            <w:pPr>
-              <w:rPr>
-                <w:lang w:val="en-ID"/>
-              </w:rPr>
-            </w:pPr>
-            <w:r>
-              <w:t>${</w:t>
-            </w:r>
-            <w:r>
-              <w:rPr>
-                <w:lang w:val="en-ID"/>
-              </w:rPr>
-              <w:t>MASALAH_KEPERAWATAN</w:t>
-            </w:r>
-            <w:r>
-              <w:rPr>
-                <w:lang w:val="en-ID"/>
-              </w:rPr>
-              <w:t>}</w:t>
-            </w:r>
-          </w:p>
-        </w:tc>
-      </w:tr>
-      <w:tr>
-        <w:tc>
-          <w:tcPr>
-            <w:tcW w:w="11307" w:type="dxa"/>
-          </w:tcPr>
-          <w:p>
-            <w:pPr>
-              <w:rPr>
-                <w:sz w:val="17"/>
-              </w:rPr>
-            </w:pPr>
-            <w:r>
-              <w:rPr>
-                <w:b/>
-                <w:bCs/>
-                <w:sz w:val="20"/>
-                <w:szCs w:val="20"/>
-              </w:rPr>
-              <w:t>PERENCANAAN TINDAKAN</w:t>
-            </w:r>
-          </w:p>
-        </w:tc>
-      </w:tr>
-      <w:tr>
-        <w:tc>
-          <w:tcPr>
-            <w:tcW w:w="11307" w:type="dxa"/>
-          </w:tcPr>
-          <w:p>
-            <w:pPr>
-              <w:rPr>
-                <w:lang w:val="en-ID"/>
-              </w:rPr>
-            </w:pPr>
-            <w:r>
-              <w:t>${</w:t>
-            </w:r>
-            <w:r>
-              <w:rPr>
-                <w:lang w:val="en-ID"/>
-              </w:rPr>
-              <w:t>PERENCANAAN_TINDAKAN</w:t>
-            </w:r>
-            <w:r>
-              <w:rPr>
-                <w:lang w:val="en-ID"/>
-              </w:rPr>
-              <w:t>}</w:t>
-            </w:r>
-          </w:p>
-        </w:tc>
-      </w:tr>
-      <w:tr>
-        <w:tc>
-          <w:tcPr>
-            <w:tcW w:w="11307" w:type="dxa"/>
-          </w:tcPr>
-          <w:p>
-            <w:pPr>
-              <w:rPr>
-                <w:sz w:val="17"/>
-              </w:rPr>
-            </w:pPr>
-            <w:r>
-              <w:rPr>
-                <w:b/>
-                <w:bCs/>
-                <w:sz w:val="20"/>
-                <w:szCs w:val="20"/>
-              </w:rPr>
-              <w:t>RENCANA ASUHAN KEPERAWATAN</w:t>
-            </w:r>
-          </w:p>
-        </w:tc>
-      </w:tr>
-      <w:tr>
-        <w:tc>
-          <w:tcPr>
-            <w:tcW w:w="11307" w:type="dxa"/>
-          </w:tcPr>
-          <w:p>
-            <w:pPr>
-              <w:rPr>
-                <w:lang w:val="en-ID"/>
-              </w:rPr>
-            </w:pPr>
-            <w:r>
-              <w:t>${</w:t>
-            </w:r>
-            <w:r>
-              <w:rPr>
-                <w:lang w:val="en-ID"/>
-              </w:rPr>
-              <w:t>RENCANA_ASUHAN_KEPERAWATAN</w:t>
-            </w:r>
-            <w:r>
-              <w:rPr>
-                <w:lang w:val="en-ID"/>
-              </w:rPr>
-              <w:t>}</w:t>
+              <w:t>RENCANA_ASUHAN_KEPERAWATAN}</w:t>
             </w:r>
           </w:p>
         </w:tc>
@@ -1934,7 +2187,7 @@
               <mc:AlternateContent>
                 <mc:Choice Requires="wps">
                   <w:drawing>
-                    <wp:anchor distT="0" distB="0" distL="114300" distR="114300" simplePos="0" relativeHeight="251678720" behindDoc="0" locked="0" layoutInCell="1" allowOverlap="1" wp14:anchorId="26AC3684" wp14:editId="37B43AC6">
+                    <wp:anchor distT="0" distB="0" distL="114300" distR="114300" simplePos="0" relativeHeight="251656192" behindDoc="0" locked="0" layoutInCell="1" allowOverlap="1" wp14:anchorId="26AC3684" wp14:editId="35670014">
                       <wp:simplePos x="0" y="0"/>
                       <wp:positionH relativeFrom="column">
                         <wp:posOffset>508000</wp:posOffset>
@@ -1977,10 +2230,7 @@
                                     <w:t>TTD</w:t>
                                   </w:r>
                                   <w:r>
-                                    <w:t>_</w:t>
-                                  </w:r>
-                                  <w:r>
-                                    <w:t>PERAWAT</w:t>
+                                    <w:t>_PERAWAT</w:t>
                                   </w:r>
                                   <w:r>
                                     <w:t>_FINALISASI</w:t>
@@ -2015,7 +2265,7 @@
                       <v:stroke joinstyle="miter"/>
                       <v:path gradientshapeok="t" o:connecttype="rect"/>
                     </v:shapetype>
-                    <v:shape id="Text Box 971992564" o:spid="_x0000_s1026" type="#_x0000_t202" style="position:absolute;left:0;text-align:left;margin-left:40pt;margin-top:10.05pt;width:188.15pt;height:91.85pt;z-index:251678720;visibility:visible;mso-wrap-style:square;mso-width-percent:0;mso-height-percent:0;mso-wrap-distance-left:9pt;mso-wrap-distance-top:0;mso-wrap-distance-right:9pt;mso-wrap-distance-bottom:0;mso-position-horizontal:absolute;mso-position-horizontal-relative:text;mso-position-vertical:absolute;mso-position-vertical-relative:text;mso-width-percent:0;mso-height-percent:0;mso-width-relative:margin;mso-height-relative:margin;v-text-anchor:middle" o:gfxdata="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" filled="f" stroked="f" strokeweight=".5pt">
+                    <v:shape id="Text Box 971992564" o:spid="_x0000_s1026" type="#_x0000_t202" style="position:absolute;left:0;text-align:left;margin-left:40pt;margin-top:10.05pt;width:188.15pt;height:91.85pt;z-index:251656192;visibility:visible;mso-wrap-style:square;mso-width-percent:0;mso-height-percent:0;mso-wrap-distance-left:9pt;mso-wrap-distance-top:0;mso-wrap-distance-right:9pt;mso-wrap-distance-bottom:0;mso-position-horizontal:absolute;mso-position-horizontal-relative:text;mso-position-vertical:absolute;mso-position-vertical-relative:text;mso-width-percent:0;mso-height-percent:0;mso-width-relative:margin;mso-height-relative:margin;v-text-anchor:middle" o:gfxdata="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" filled="f" stroked="f" strokeweight=".5pt">
                       <v:textbox>
                         <w:txbxContent>
                           <w:p>
@@ -2029,10 +2279,7 @@
                               <w:t>TTD</w:t>
                             </w:r>
                             <w:r>
-                              <w:t>_</w:t>
-                            </w:r>
-                            <w:r>
-                              <w:t>PERAWAT</w:t>
+                              <w:t>_PERAWAT</w:t>
                             </w:r>
                             <w:r>
                               <w:t>_FINALISASI</w:t>
@@ -2053,33 +2300,8 @@
                 <w:b/>
                 <w:bCs/>
               </w:rPr>
-              <w:t xml:space="preserve">Yang </w:t>
-            </w:r>
-            <w:proofErr w:type="spellStart"/>
-            <w:r>
-              <w:rPr>
-                <w:b/>
-                <w:bCs/>
-              </w:rPr>
-              <w:t>Melakukan</w:t>
-            </w:r>
-            <w:proofErr w:type="spellEnd"/>
-            <w:r>
-              <w:rPr>
-                <w:b/>
-                <w:bCs/>
-              </w:rPr>
-              <w:t xml:space="preserve"> </w:t>
-            </w:r>
-            <w:proofErr w:type="spellStart"/>
-            <w:r>
-              <w:rPr>
-                <w:b/>
-                <w:bCs/>
-              </w:rPr>
-              <w:t>Pengkajian</w:t>
-            </w:r>
-            <w:proofErr w:type="spellEnd"/>
+              <w:t>Yang Melakukan Pengkajian</w:t>
+            </w:r>
           </w:p>
           <w:p>
             <w:pPr>
@@ -2089,7 +2311,6 @@
                 <w:bCs/>
               </w:rPr>
             </w:pPr>
-            <w:proofErr w:type="spellStart"/>
             <w:r>
               <w:rPr>
                 <w:b/>
@@ -2097,7 +2318,6 @@
               </w:rPr>
               <w:t>Perawat</w:t>
             </w:r>
-            <w:proofErr w:type="spellEnd"/>
           </w:p>
           <w:p>
             <w:pPr>
@@ -2128,7 +2348,6 @@
             <w:pPr>
               <w:jc w:val="center"/>
             </w:pPr>
-            <w:proofErr w:type="gramStart"/>
             <w:r>
               <w:t xml:space="preserve">( </w:t>
             </w:r>
@@ -2136,32 +2355,23 @@
               <w:rPr>
                 <w:u w:val="single"/>
               </w:rPr>
-              <w:t>$</w:t>
-            </w:r>
-            <w:proofErr w:type="gramEnd"/>
+              <w:t>${</w:t>
+            </w:r>
             <w:r>
               <w:rPr>
                 <w:u w:val="single"/>
               </w:rPr>
-              <w:t>{</w:t>
+              <w:t>NAMA_PERAWAT_FINALISASI</w:t>
             </w:r>
             <w:r>
               <w:rPr>
                 <w:u w:val="single"/>
               </w:rPr>
-              <w:t>NAMA_PERAWAT_FINALISASI</w:t>
-            </w:r>
-            <w:proofErr w:type="gramStart"/>
-            <w:r>
-              <w:rPr>
-                <w:u w:val="single"/>
-              </w:rPr>
               <w:t>}</w:t>
             </w:r>
             <w:r>
               <w:t xml:space="preserve"> )</w:t>
             </w:r>
-            <w:proofErr w:type="gramEnd"/>
           </w:p>
           <w:p>
             <w:pPr>
@@ -2178,18 +2388,8 @@
                 <w:szCs w:val="18"/>
                 <w:lang w:val="en-ID"/>
               </w:rPr>
-              <w:t xml:space="preserve">Tanda Tangan dan Nama </w:t>
-            </w:r>
-            <w:proofErr w:type="spellStart"/>
-            <w:r>
-              <w:rPr>
-                <w:sz w:val="14"/>
-                <w:szCs w:val="18"/>
-                <w:lang w:val="en-ID"/>
-              </w:rPr>
-              <w:t>Lengkap</w:t>
-            </w:r>
-            <w:proofErr w:type="spellEnd"/>
+              <w:t>Tanda Tangan dan Nama Lengkap</w:t>
+            </w:r>
           </w:p>
           <w:p>
             <w:pPr>
@@ -2270,7 +2470,7 @@
               <mc:AlternateContent>
                 <mc:Choice Requires="wps">
                   <w:drawing>
-                    <wp:anchor distT="0" distB="0" distL="114300" distR="114300" simplePos="0" relativeHeight="251668480" behindDoc="0" locked="0" layoutInCell="1" allowOverlap="1" wp14:anchorId="1B7476A5" wp14:editId="47300360">
+                    <wp:anchor distT="0" distB="0" distL="114300" distR="114300" simplePos="0" relativeHeight="251654144" behindDoc="0" locked="0" layoutInCell="1" allowOverlap="1" wp14:anchorId="1B7476A5" wp14:editId="5F0A1427">
                       <wp:simplePos x="0" y="0"/>
                       <wp:positionH relativeFrom="column">
                         <wp:posOffset>508000</wp:posOffset>
@@ -2344,7 +2544,7 @@
                 </mc:Choice>
                 <mc:Fallback>
                   <w:pict>
-                    <v:shape w14:anchorId="1B7476A5" id="Text Box 7" o:spid="_x0000_s1027" type="#_x0000_t202" style="position:absolute;left:0;text-align:left;margin-left:40pt;margin-top:10.05pt;width:188.15pt;height:91.85pt;z-index:251668480;visibility:visible;mso-wrap-style:square;mso-width-percent:0;mso-height-percent:0;mso-wrap-distance-left:9pt;mso-wrap-distance-top:0;mso-wrap-distance-right:9pt;mso-wrap-distance-bottom:0;mso-position-horizontal:absolute;mso-position-horizontal-relative:text;mso-position-vertical:absolute;mso-position-vertical-relative:text;mso-width-percent:0;mso-height-percent:0;mso-width-relative:margin;mso-height-relative:margin;v-text-anchor:middle" o:gfxdata="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" filled="f" stroked="f" strokeweight=".5pt">
+                    <v:shape w14:anchorId="1B7476A5" id="Text Box 7" o:spid="_x0000_s1027" type="#_x0000_t202" style="position:absolute;left:0;text-align:left;margin-left:40pt;margin-top:10.05pt;width:188.15pt;height:91.85pt;z-index:251654144;visibility:visible;mso-wrap-style:square;mso-width-percent:0;mso-height-percent:0;mso-wrap-distance-left:9pt;mso-wrap-distance-top:0;mso-wrap-distance-right:9pt;mso-wrap-distance-bottom:0;mso-position-horizontal:absolute;mso-position-horizontal-relative:text;mso-position-vertical:absolute;mso-position-vertical-relative:text;mso-width-percent:0;mso-height-percent:0;mso-width-relative:margin;mso-height-relative:margin;v-text-anchor:middle" o:gfxdata="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" filled="f" stroked="f" strokeweight=".5pt">
                       <v:textbox>
                         <w:txbxContent>
                           <w:p>
@@ -2374,7 +2574,6 @@
                 </mc:Fallback>
               </mc:AlternateContent>
             </w:r>
-            <w:proofErr w:type="spellStart"/>
             <w:r>
               <w:rPr>
                 <w:b/>
@@ -2382,7 +2581,6 @@
               </w:rPr>
               <w:t>Verifikasi</w:t>
             </w:r>
-            <w:proofErr w:type="spellEnd"/>
           </w:p>
           <w:p>
             <w:pPr>
@@ -2429,7 +2627,6 @@
             <w:pPr>
               <w:jc w:val="center"/>
             </w:pPr>
-            <w:proofErr w:type="gramStart"/>
             <w:r>
               <w:t xml:space="preserve">( </w:t>
             </w:r>
@@ -2437,32 +2634,23 @@
               <w:rPr>
                 <w:u w:val="single"/>
               </w:rPr>
-              <w:t>$</w:t>
-            </w:r>
-            <w:proofErr w:type="gramEnd"/>
+              <w:t>${</w:t>
+            </w:r>
             <w:r>
               <w:rPr>
                 <w:u w:val="single"/>
               </w:rPr>
-              <w:t>{</w:t>
+              <w:t>NAMA_DOKTER_FINALISASI</w:t>
             </w:r>
             <w:r>
               <w:rPr>
                 <w:u w:val="single"/>
               </w:rPr>
-              <w:t>NAMA_DOKTER_FINALISASI</w:t>
-            </w:r>
-            <w:proofErr w:type="gramStart"/>
-            <w:r>
-              <w:rPr>
-                <w:u w:val="single"/>
-              </w:rPr>
               <w:t>}</w:t>
             </w:r>
             <w:r>
               <w:t xml:space="preserve"> )</w:t>
             </w:r>
-            <w:proofErr w:type="gramEnd"/>
           </w:p>
           <w:p>
             <w:pPr>
@@ -2479,18 +2667,8 @@
                 <w:szCs w:val="18"/>
                 <w:lang w:val="en-ID"/>
               </w:rPr>
-              <w:t xml:space="preserve">Tanda Tangan dan Nama </w:t>
-            </w:r>
-            <w:proofErr w:type="spellStart"/>
-            <w:r>
-              <w:rPr>
-                <w:sz w:val="14"/>
-                <w:szCs w:val="18"/>
-                <w:lang w:val="en-ID"/>
-              </w:rPr>
-              <w:t>Lengkap</w:t>
-            </w:r>
-            <w:proofErr w:type="spellEnd"/>
+              <w:t>Tanda Tangan dan Nama Lengkap</w:t>
+            </w:r>
           </w:p>
           <w:p>
             <w:pPr>
@@ -2606,7 +2784,6 @@
         <w:lang w:val="en-ID"/>
       </w:rPr>
     </w:pPr>
-    <w:proofErr w:type="spellStart"/>
     <w:r>
       <w:rPr>
         <w:i/>
@@ -2614,57 +2791,7 @@
         <w:sz w:val="16"/>
         <w:szCs w:val="20"/>
       </w:rPr>
-      <w:t>Formulir</w:t>
-    </w:r>
-    <w:proofErr w:type="spellEnd"/>
-    <w:r>
-      <w:rPr>
-        <w:i/>
-        <w:iCs/>
-        <w:sz w:val="16"/>
-        <w:szCs w:val="20"/>
-      </w:rPr>
-      <w:t xml:space="preserve"> </w:t>
-    </w:r>
-    <w:proofErr w:type="spellStart"/>
-    <w:r>
-      <w:rPr>
-        <w:i/>
-        <w:iCs/>
-        <w:sz w:val="16"/>
-        <w:szCs w:val="20"/>
-      </w:rPr>
-      <w:t>ini</w:t>
-    </w:r>
-    <w:proofErr w:type="spellEnd"/>
-    <w:r>
-      <w:rPr>
-        <w:i/>
-        <w:iCs/>
-        <w:sz w:val="16"/>
-        <w:szCs w:val="20"/>
-      </w:rPr>
-      <w:t xml:space="preserve"> </w:t>
-    </w:r>
-    <w:proofErr w:type="spellStart"/>
-    <w:r>
-      <w:rPr>
-        <w:i/>
-        <w:iCs/>
-        <w:sz w:val="16"/>
-        <w:szCs w:val="20"/>
-      </w:rPr>
-      <w:t>dicetak</w:t>
-    </w:r>
-    <w:proofErr w:type="spellEnd"/>
-    <w:r>
-      <w:rPr>
-        <w:i/>
-        <w:iCs/>
-        <w:sz w:val="16"/>
-        <w:szCs w:val="20"/>
-      </w:rPr>
-      <w:t xml:space="preserve"> pada ${</w:t>
+      <w:t>Formulir ini dicetak pada ${</w:t>
     </w:r>
     <w:r>
       <w:rPr>
@@ -3306,7 +3433,7 @@
   <w:style w:type="paragraph" w:default="1" w:styleId="Normal">
     <w:name w:val="Normal"/>
     <w:qFormat/>
-    <w:rsid w:val="00A95A09"/>
+    <w:rsid w:val="00E94206"/>
     <w:pPr>
       <w:spacing w:after="40"/>
     </w:pPr>
@@ -3527,6 +3654,7 @@
   <w:style w:type="character" w:default="1" w:styleId="DefaultParagraphFont">
     <w:name w:val="Default Paragraph Font"/>
     <w:uiPriority w:val="1"/>
+    <w:semiHidden/>
     <w:unhideWhenUsed/>
   </w:style>
   <w:style w:type="table" w:default="1" w:styleId="TableNormal">

</xml_diff>

<commit_message>
fix docx print preview RJD Perawat
</commit_message>
<xml_diff>
--- a/public/doc/emr/print_rajal_dewasa_perawat.docx
+++ b/public/doc/emr/print_rajal_dewasa_perawat.docx
@@ -1,6 +1,6 @@
 
 <file path=word/document.xml><?xml version="1.0" encoding="utf-8"?>
-<w:document xmlns:wpc="http://schemas.microsoft.com/office/word/2010/wordprocessingCanvas" xmlns:cx="http://schemas.microsoft.com/office/drawing/2014/chartex" xmlns:cx1="http://schemas.microsoft.com/office/drawing/2015/9/8/chartex" xmlns:cx2="http://schemas.microsoft.com/office/drawing/2015/10/21/chartex" xmlns:cx3="http://schemas.microsoft.com/office/drawing/2016/5/9/chartex" xmlns:cx4="http://schemas.microsoft.com/office/drawing/2016/5/10/chartex" xmlns:cx5="http://schemas.microsoft.com/office/drawing/2016/5/11/chartex" xmlns:cx6="http://schemas.microsoft.com/office/drawing/2016/5/12/chartex" xmlns:cx7="http://schemas.microsoft.com/office/drawing/2016/5/13/chartex" xmlns:cx8="http://schemas.microsoft.com/office/drawing/2016/5/14/chartex" xmlns:mc="http://schemas.openxmlformats.org/markup-compatibility/2006" xmlns:aink="http://schemas.microsoft.com/office/drawing/2016/ink" xmlns:am3d="http://schemas.microsoft.com/office/drawing/2017/model3d" xmlns:o="urn:schemas-microsoft-com:office:office" xmlns:oel="http://schemas.microsoft.com/office/2019/extlst" xmlns:r="http://schemas.openxmlformats.org/officeDocument/2006/relationships" xmlns:m="http://schemas.openxmlformats.org/officeDocument/2006/math" xmlns:v="urn:schemas-microsoft-com:vml" xmlns:wp14="http://schemas.microsoft.com/office/word/2010/wordprocessingDrawing" xmlns:wp="http://schemas.openxmlformats.org/drawingml/2006/wordprocessingDrawing" xmlns:w10="urn:schemas-microsoft-com:office:word" xmlns:w="http://schemas.openxmlformats.org/wordprocessingml/2006/main" xmlns:w14="http://schemas.microsoft.com/office/word/2010/wordml" xmlns:w15="http://schemas.microsoft.com/office/word/2012/wordml" xmlns:w16cex="http://schemas.microsoft.com/office/word/2018/wordml/cex" xmlns:w16cid="http://schemas.microsoft.com/office/word/2016/wordml/cid" xmlns:w16="http://schemas.microsoft.com/office/word/2018/wordml" xmlns:w16du="http://schemas.microsoft.com/office/word/2023/wordml/word16du" xmlns:w16sdtdh="http://schemas.microsoft.com/office/word/2020/wordml/sdtdatahash" xmlns:w16sdtfl="http://schemas.microsoft.com/office/word/2024/wordml/sdtformatlock" xmlns:w16se="http://schemas.microsoft.com/office/word/2015/wordml/symex" xmlns:wpg="http://schemas.microsoft.com/office/word/2010/wordprocessingGroup" xmlns:wpi="http://schemas.microsoft.com/office/word/2010/wordprocessingInk" xmlns:wne="http://schemas.microsoft.com/office/word/2006/wordml" xmlns:wps="http://schemas.microsoft.com/office/word/2010/wordprocessingShape" mc:Ignorable="w14 w15 w16se w16cid w16 w16cex w16sdtdh w16sdtfl w16du wp14">
+<w:document xmlns:wpc="http://schemas.microsoft.com/office/word/2010/wordprocessingCanvas" xmlns:cx="http://schemas.microsoft.com/office/drawing/2014/chartex" xmlns:cx1="http://schemas.microsoft.com/office/drawing/2015/9/8/chartex" xmlns:cx2="http://schemas.microsoft.com/office/drawing/2015/10/21/chartex" xmlns:cx3="http://schemas.microsoft.com/office/drawing/2016/5/9/chartex" xmlns:cx4="http://schemas.microsoft.com/office/drawing/2016/5/10/chartex" xmlns:cx5="http://schemas.microsoft.com/office/drawing/2016/5/11/chartex" xmlns:cx6="http://schemas.microsoft.com/office/drawing/2016/5/12/chartex" xmlns:cx7="http://schemas.microsoft.com/office/drawing/2016/5/13/chartex" xmlns:cx8="http://schemas.microsoft.com/office/drawing/2016/5/14/chartex" xmlns:mc="http://schemas.openxmlformats.org/markup-compatibility/2006" xmlns:aink="http://schemas.microsoft.com/office/drawing/2016/ink" xmlns:am3d="http://schemas.microsoft.com/office/drawing/2017/model3d" xmlns:o="urn:schemas-microsoft-com:office:office" xmlns:r="http://schemas.openxmlformats.org/officeDocument/2006/relationships" xmlns:m="http://schemas.openxmlformats.org/officeDocument/2006/math" xmlns:v="urn:schemas-microsoft-com:vml" xmlns:wp14="http://schemas.microsoft.com/office/word/2010/wordprocessingDrawing" xmlns:wp="http://schemas.openxmlformats.org/drawingml/2006/wordprocessingDrawing" xmlns:w10="urn:schemas-microsoft-com:office:word" xmlns:w="http://schemas.openxmlformats.org/wordprocessingml/2006/main" xmlns:w14="http://schemas.microsoft.com/office/word/2010/wordml" xmlns:w15="http://schemas.microsoft.com/office/word/2012/wordml" xmlns:w16cex="http://schemas.microsoft.com/office/word/2018/wordml/cex" xmlns:w16cid="http://schemas.microsoft.com/office/word/2016/wordml/cid" xmlns:w16="http://schemas.microsoft.com/office/word/2018/wordml" xmlns:w16sdtdh="http://schemas.microsoft.com/office/word/2020/wordml/sdtdatahash" xmlns:w16se="http://schemas.microsoft.com/office/word/2015/wordml/symex" xmlns:wpg="http://schemas.microsoft.com/office/word/2010/wordprocessingGroup" xmlns:wpi="http://schemas.microsoft.com/office/word/2010/wordprocessingInk" xmlns:wne="http://schemas.microsoft.com/office/word/2006/wordml" xmlns:wps="http://schemas.microsoft.com/office/word/2010/wordprocessingShape" mc:Ignorable="w14 w15 w16se w16cid w16 w16cex w16sdtdh wp14">
   <w:body>
     <w:tbl>
       <w:tblPr>
@@ -654,8 +654,11 @@
         <w:tblLook w:val="04A0" w:firstRow="1" w:lastRow="0" w:firstColumn="1" w:lastColumn="0" w:noHBand="0" w:noVBand="1"/>
       </w:tblPr>
       <w:tblGrid>
-        <w:gridCol w:w="2802"/>
-        <w:gridCol w:w="8505"/>
+        <w:gridCol w:w="370"/>
+        <w:gridCol w:w="2426"/>
+        <w:gridCol w:w="6"/>
+        <w:gridCol w:w="261"/>
+        <w:gridCol w:w="8244"/>
       </w:tblGrid>
       <w:tr>
         <w:trPr>
@@ -664,6 +667,7 @@
         <w:tc>
           <w:tcPr>
             <w:tcW w:w="2802" w:type="dxa"/>
+            <w:gridSpan w:val="3"/>
           </w:tcPr>
           <w:p>
             <w:pPr>
@@ -697,6 +701,7 @@
         <w:tc>
           <w:tcPr>
             <w:tcW w:w="8505" w:type="dxa"/>
+            <w:gridSpan w:val="2"/>
             <w:vAlign w:val="center"/>
           </w:tcPr>
           <w:p>
@@ -711,64 +716,6 @@
                 <w:sz w:val="17"/>
               </w:rPr>
               <w:t>${ANAMNESIS_DIPEROLEH}</w:t>
-            </w:r>
-          </w:p>
-        </w:tc>
-      </w:tr>
-    </w:tbl>
-    <w:tbl>
-      <w:tblPr>
-        <w:tblStyle w:val="TableGrid"/>
-        <w:tblW w:w="0" w:type="auto"/>
-        <w:tblLook w:val="04A0" w:firstRow="1" w:lastRow="0" w:firstColumn="1" w:lastColumn="0" w:noHBand="0" w:noVBand="1"/>
-      </w:tblPr>
-      <w:tblGrid>
-        <w:gridCol w:w="370"/>
-        <w:gridCol w:w="2426"/>
-        <w:gridCol w:w="267"/>
-        <w:gridCol w:w="8244"/>
-      </w:tblGrid>
-      <w:tr>
-        <w:tc>
-          <w:tcPr>
-            <w:tcW w:w="370" w:type="dxa"/>
-          </w:tcPr>
-          <w:p>
-            <w:r>
-              <w:t>1.</w:t>
-            </w:r>
-          </w:p>
-        </w:tc>
-        <w:tc>
-          <w:tcPr>
-            <w:tcW w:w="2426" w:type="dxa"/>
-          </w:tcPr>
-          <w:p>
-            <w:r>
-              <w:t>Keluhan Utama</w:t>
-            </w:r>
-          </w:p>
-        </w:tc>
-        <w:tc>
-          <w:tcPr>
-            <w:tcW w:w="267" w:type="dxa"/>
-          </w:tcPr>
-          <w:p>
-            <w:r>
-              <w:t>:</w:t>
-            </w:r>
-          </w:p>
-        </w:tc>
-        <w:tc>
-          <w:tcPr>
-            <w:tcW w:w="8244" w:type="dxa"/>
-          </w:tcPr>
-          <w:p>
-            <w:r>
-              <w:rPr>
-                <w:sz w:val="17"/>
-              </w:rPr>
-              <w:t>${KELUHAN_UTAMA}</w:t>
             </w:r>
           </w:p>
         </w:tc>
@@ -780,7 +727,7 @@
           </w:tcPr>
           <w:p>
             <w:r>
-              <w:t>2.</w:t>
+              <w:t>1.</w:t>
             </w:r>
           </w:p>
         </w:tc>
@@ -790,13 +737,14 @@
           </w:tcPr>
           <w:p>
             <w:r>
-              <w:t>Riwayat Penyakit Sekarang</w:t>
+              <w:t>Keluhan Utama</w:t>
             </w:r>
           </w:p>
         </w:tc>
         <w:tc>
           <w:tcPr>
             <w:tcW w:w="267" w:type="dxa"/>
+            <w:gridSpan w:val="2"/>
           </w:tcPr>
           <w:p>
             <w:r>
@@ -813,7 +761,7 @@
               <w:rPr>
                 <w:sz w:val="17"/>
               </w:rPr>
-              <w:t>${RIWAYAT_PENYAKIT_SEKARANG}</w:t>
+              <w:t>${KELUHAN_UTAMA}</w:t>
             </w:r>
           </w:p>
         </w:tc>
@@ -825,7 +773,7 @@
           </w:tcPr>
           <w:p>
             <w:r>
-              <w:t>3.</w:t>
+              <w:t>2.</w:t>
             </w:r>
           </w:p>
         </w:tc>
@@ -835,13 +783,14 @@
           </w:tcPr>
           <w:p>
             <w:r>
-              <w:t>Riwayat Penyakit Dahulu</w:t>
+              <w:t>Riwayat Penyakit Sekarang</w:t>
             </w:r>
           </w:p>
         </w:tc>
         <w:tc>
           <w:tcPr>
             <w:tcW w:w="267" w:type="dxa"/>
+            <w:gridSpan w:val="2"/>
           </w:tcPr>
           <w:p>
             <w:r>
@@ -858,7 +807,7 @@
               <w:rPr>
                 <w:sz w:val="17"/>
               </w:rPr>
-              <w:t>${RIWAYAT_PENYAKIT_DAHULU}</w:t>
+              <w:t>${RIWAYAT_PENYAKIT_SEKARANG}</w:t>
             </w:r>
           </w:p>
         </w:tc>
@@ -870,7 +819,7 @@
           </w:tcPr>
           <w:p>
             <w:r>
-              <w:t>4.</w:t>
+              <w:t>3.</w:t>
             </w:r>
           </w:p>
         </w:tc>
@@ -880,13 +829,60 @@
           </w:tcPr>
           <w:p>
             <w:r>
-              <w:t>Riwayat Penyakit Keluarga</w:t>
+              <w:t>Riwayat Penyakit Dahulu</w:t>
             </w:r>
           </w:p>
         </w:tc>
         <w:tc>
           <w:tcPr>
             <w:tcW w:w="267" w:type="dxa"/>
+            <w:gridSpan w:val="2"/>
+          </w:tcPr>
+          <w:p>
+            <w:r>
+              <w:t>:</w:t>
+            </w:r>
+          </w:p>
+        </w:tc>
+        <w:tc>
+          <w:tcPr>
+            <w:tcW w:w="8244" w:type="dxa"/>
+          </w:tcPr>
+          <w:p>
+            <w:r>
+              <w:rPr>
+                <w:sz w:val="17"/>
+              </w:rPr>
+              <w:t>${RIWAYAT_PENYAKIT_DAHULU}</w:t>
+            </w:r>
+          </w:p>
+        </w:tc>
+      </w:tr>
+      <w:tr>
+        <w:tc>
+          <w:tcPr>
+            <w:tcW w:w="370" w:type="dxa"/>
+          </w:tcPr>
+          <w:p>
+            <w:r>
+              <w:t>4.</w:t>
+            </w:r>
+          </w:p>
+        </w:tc>
+        <w:tc>
+          <w:tcPr>
+            <w:tcW w:w="2426" w:type="dxa"/>
+          </w:tcPr>
+          <w:p>
+            <w:r>
+              <w:t>Riwayat Penyakit Keluarga</w:t>
+            </w:r>
+          </w:p>
+        </w:tc>
+        <w:tc>
+          <w:tcPr>
+            <w:tcW w:w="267" w:type="dxa"/>
+            <w:gridSpan w:val="2"/>
           </w:tcPr>
           <w:p>
             <w:r>
@@ -1292,250 +1288,6 @@
       </w:tr>
     </w:tbl>
     <w:p/>
-    <w:p/>
-    <w:tbl>
-      <w:tblPr>
-        <w:tblStyle w:val="TableGrid"/>
-        <w:tblW w:w="0" w:type="auto"/>
-        <w:tblLook w:val="04A0" w:firstRow="1" w:lastRow="0" w:firstColumn="1" w:lastColumn="0" w:noHBand="0" w:noVBand="1"/>
-      </w:tblPr>
-      <w:tblGrid>
-        <w:gridCol w:w="11307"/>
-      </w:tblGrid>
-      <w:tr>
-        <w:tc>
-          <w:tcPr>
-            <w:tcW w:w="11307" w:type="dxa"/>
-          </w:tcPr>
-          <w:p>
-            <w:pPr>
-              <w:rPr>
-                <w:b/>
-                <w:bCs/>
-                <w:sz w:val="20"/>
-                <w:szCs w:val="20"/>
-                <w:lang w:val="en-ID"/>
-              </w:rPr>
-            </w:pPr>
-            <w:r>
-              <w:rPr>
-                <w:b/>
-                <w:bCs/>
-                <w:sz w:val="20"/>
-                <w:szCs w:val="20"/>
-                <w:lang w:val="en-ID"/>
-              </w:rPr>
-              <w:t>PSIKOLOGI - SOSIAL - EKONOMI - SPIRITUAL - FUNGSIONAL</w:t>
-            </w:r>
-          </w:p>
-        </w:tc>
-      </w:tr>
-      <w:tr>
-        <w:tc>
-          <w:tcPr>
-            <w:tcW w:w="11307" w:type="dxa"/>
-          </w:tcPr>
-          <w:p>
-            <w:pPr>
-              <w:rPr>
-                <w:lang w:val="en-ID"/>
-              </w:rPr>
-            </w:pPr>
-            <w:r>
-              <w:t>${</w:t>
-            </w:r>
-            <w:r>
-              <w:rPr>
-                <w:lang w:val="en-ID"/>
-              </w:rPr>
-              <w:t>PSIKOLOGI_SOSIAL_EKONOMI_SPIRITUAL</w:t>
-            </w:r>
-            <w:r>
-              <w:t>}</w:t>
-            </w:r>
-            <w:r>
-              <w:br/>
-            </w:r>
-            <w:r>
-              <w:t>${</w:t>
-            </w:r>
-            <w:r>
-              <w:t>STATUS_FUNGSIONAL</w:t>
-            </w:r>
-            <w:r>
-              <w:t>}</w:t>
-            </w:r>
-          </w:p>
-        </w:tc>
-      </w:tr>
-      <w:tr>
-        <w:tc>
-          <w:tcPr>
-            <w:tcW w:w="11307" w:type="dxa"/>
-          </w:tcPr>
-          <w:p>
-            <w:pPr>
-              <w:rPr>
-                <w:b/>
-                <w:bCs/>
-                <w:sz w:val="17"/>
-                <w:lang w:val="en-ID"/>
-              </w:rPr>
-            </w:pPr>
-            <w:r>
-              <w:rPr>
-                <w:b/>
-                <w:bCs/>
-                <w:sz w:val="20"/>
-                <w:szCs w:val="20"/>
-                <w:lang w:val="en-ID"/>
-              </w:rPr>
-              <w:t>SKRINING NYERI</w:t>
-            </w:r>
-          </w:p>
-        </w:tc>
-      </w:tr>
-      <w:tr>
-        <w:tc>
-          <w:tcPr>
-            <w:tcW w:w="11307" w:type="dxa"/>
-          </w:tcPr>
-          <w:p>
-            <w:pPr>
-              <w:rPr>
-                <w:sz w:val="17"/>
-                <w:lang w:val="en-ID"/>
-              </w:rPr>
-            </w:pPr>
-            <w:r>
-              <w:rPr>
-                <w:sz w:val="17"/>
-              </w:rPr>
-              <w:t>${</w:t>
-            </w:r>
-            <w:r>
-              <w:rPr>
-                <w:sz w:val="17"/>
-                <w:lang w:val="en-ID"/>
-              </w:rPr>
-              <w:t>SKRINING_NYERI</w:t>
-            </w:r>
-            <w:r>
-              <w:rPr>
-                <w:sz w:val="17"/>
-                <w:lang w:val="en-ID"/>
-              </w:rPr>
-              <w:t>}</w:t>
-            </w:r>
-          </w:p>
-        </w:tc>
-      </w:tr>
-      <w:tr>
-        <w:tc>
-          <w:tcPr>
-            <w:tcW w:w="11307" w:type="dxa"/>
-          </w:tcPr>
-          <w:p>
-            <w:pPr>
-              <w:rPr>
-                <w:sz w:val="17"/>
-              </w:rPr>
-            </w:pPr>
-            <w:r>
-              <w:rPr>
-                <w:b/>
-                <w:bCs/>
-                <w:sz w:val="20"/>
-                <w:szCs w:val="20"/>
-              </w:rPr>
-              <w:t>SKRINING RISIKO JATUH</w:t>
-            </w:r>
-          </w:p>
-        </w:tc>
-      </w:tr>
-      <w:tr>
-        <w:tc>
-          <w:tcPr>
-            <w:tcW w:w="11307" w:type="dxa"/>
-          </w:tcPr>
-          <w:p>
-            <w:pPr>
-              <w:rPr>
-                <w:lang w:val="en-ID"/>
-              </w:rPr>
-            </w:pPr>
-            <w:r>
-              <w:t>${</w:t>
-            </w:r>
-            <w:r>
-              <w:rPr>
-                <w:lang w:val="en-ID"/>
-              </w:rPr>
-              <w:t>SKRINING_RISIKO_JATUH</w:t>
-            </w:r>
-            <w:r>
-              <w:rPr>
-                <w:lang w:val="en-ID"/>
-              </w:rPr>
-              <w:t>}</w:t>
-            </w:r>
-          </w:p>
-        </w:tc>
-      </w:tr>
-      <w:tr>
-        <w:tc>
-          <w:tcPr>
-            <w:tcW w:w="11307" w:type="dxa"/>
-          </w:tcPr>
-          <w:p>
-            <w:pPr>
-              <w:rPr>
-                <w:sz w:val="17"/>
-              </w:rPr>
-            </w:pPr>
-            <w:r>
-              <w:rPr>
-                <w:b/>
-                <w:bCs/>
-                <w:sz w:val="20"/>
-                <w:szCs w:val="20"/>
-              </w:rPr>
-              <w:t>SKRINING GIZI</w:t>
-            </w:r>
-          </w:p>
-        </w:tc>
-      </w:tr>
-      <w:tr>
-        <w:tc>
-          <w:tcPr>
-            <w:tcW w:w="11307" w:type="dxa"/>
-          </w:tcPr>
-          <w:p>
-            <w:pPr>
-              <w:rPr>
-                <w:lang w:val="en-ID"/>
-              </w:rPr>
-            </w:pPr>
-            <w:r>
-              <w:t>${</w:t>
-            </w:r>
-            <w:r>
-              <w:rPr>
-                <w:lang w:val="en-ID"/>
-              </w:rPr>
-              <w:t>SKRINING_</w:t>
-            </w:r>
-            <w:r>
-              <w:rPr>
-                <w:lang w:val="en-ID"/>
-              </w:rPr>
-              <w:t>GIZI}</w:t>
-            </w:r>
-          </w:p>
-        </w:tc>
-      </w:tr>
-    </w:tbl>
-    <w:p/>
     <w:tbl>
       <w:tblPr>
         <w:tblStyle w:val="TableGrid"/>
@@ -1556,17 +1308,22 @@
           <w:p>
             <w:pPr>
               <w:rPr>
-                <w:sz w:val="17"/>
-              </w:rPr>
-            </w:pPr>
-            <w:r>
-              <w:rPr>
                 <w:b/>
                 <w:bCs/>
                 <w:sz w:val="20"/>
                 <w:szCs w:val="20"/>
-              </w:rPr>
-              <w:t>EDUKASI</w:t>
+                <w:lang w:val="en-ID"/>
+              </w:rPr>
+            </w:pPr>
+            <w:r>
+              <w:rPr>
+                <w:b/>
+                <w:bCs/>
+                <w:sz w:val="20"/>
+                <w:szCs w:val="20"/>
+                <w:lang w:val="en-ID"/>
+              </w:rPr>
+              <w:t>PSIKOLOGI - SOSIAL - EKONOMI - SPIRITUAL - FUNGSIONAL</w:t>
             </w:r>
           </w:p>
         </w:tc>
@@ -1580,22 +1337,31 @@
           <w:p>
             <w:pPr>
               <w:rPr>
-                <w:b/>
-                <w:bCs/>
-                <w:sz w:val="20"/>
-                <w:szCs w:val="20"/>
+                <w:lang w:val="en-ID"/>
               </w:rPr>
             </w:pPr>
             <w:r>
               <w:t>${</w:t>
             </w:r>
             <w:r>
-              <w:t>KESEDIAAN_DAN_HAMBATAN</w:t>
-            </w:r>
-            <w:r>
               <w:rPr>
                 <w:lang w:val="en-ID"/>
               </w:rPr>
+              <w:t>HUBUNGAN_STATUS_PSIKOSOSIAL</w:t>
+            </w:r>
+            <w:r>
+              <w:t>}</w:t>
+            </w:r>
+            <w:r>
+              <w:br/>
+            </w:r>
+            <w:r>
+              <w:t>${</w:t>
+            </w:r>
+            <w:r>
+              <w:t>STATUS_FUNGSIONAL</w:t>
+            </w:r>
+            <w:r>
               <w:t>}</w:t>
             </w:r>
           </w:p>
@@ -1612,8 +1378,8 @@
               <w:rPr>
                 <w:b/>
                 <w:bCs/>
-                <w:sz w:val="20"/>
-                <w:szCs w:val="20"/>
+                <w:sz w:val="17"/>
+                <w:lang w:val="en-ID"/>
               </w:rPr>
             </w:pPr>
             <w:r>
@@ -1622,109 +1388,9 @@
                 <w:bCs/>
                 <w:sz w:val="20"/>
                 <w:szCs w:val="20"/>
-              </w:rPr>
-              <w:t>Kebutuhan Edukasi</w:t>
-            </w:r>
-          </w:p>
-        </w:tc>
-      </w:tr>
-      <w:tr>
-        <w:tc>
-          <w:tcPr>
-            <w:tcW w:w="3769" w:type="dxa"/>
-          </w:tcPr>
-          <w:p>
-            <w:pPr>
-              <w:rPr>
                 <w:lang w:val="en-ID"/>
               </w:rPr>
-            </w:pPr>
-            <w:r>
-              <w:t>${</w:t>
-            </w:r>
-            <w:r>
-              <w:rPr>
-                <w:lang w:val="en-ID"/>
-              </w:rPr>
-              <w:t>KEBUTUHAN_EDUKASI</w:t>
-            </w:r>
-            <w:r>
-              <w:rPr>
-                <w:lang w:val="en-ID"/>
-              </w:rPr>
-              <w:t>_1</w:t>
-            </w:r>
-            <w:r>
-              <w:rPr>
-                <w:lang w:val="en-ID"/>
-              </w:rPr>
-              <w:t>}</w:t>
-            </w:r>
-          </w:p>
-        </w:tc>
-        <w:tc>
-          <w:tcPr>
-            <w:tcW w:w="3769" w:type="dxa"/>
-          </w:tcPr>
-          <w:p>
-            <w:pPr>
-              <w:rPr>
-                <w:lang w:val="en-ID"/>
-              </w:rPr>
-            </w:pPr>
-            <w:r>
-              <w:t>${</w:t>
-            </w:r>
-            <w:r>
-              <w:rPr>
-                <w:lang w:val="en-ID"/>
-              </w:rPr>
-              <w:t>KEBUTUHAN_EDUKASI_</w:t>
-            </w:r>
-            <w:r>
-              <w:rPr>
-                <w:lang w:val="en-ID"/>
-              </w:rPr>
-              <w:t>2</w:t>
-            </w:r>
-            <w:r>
-              <w:rPr>
-                <w:lang w:val="en-ID"/>
-              </w:rPr>
-              <w:t>}</w:t>
-            </w:r>
-          </w:p>
-        </w:tc>
-        <w:tc>
-          <w:tcPr>
-            <w:tcW w:w="3769" w:type="dxa"/>
-          </w:tcPr>
-          <w:p>
-            <w:pPr>
-              <w:rPr>
-                <w:lang w:val="en-ID"/>
-              </w:rPr>
-            </w:pPr>
-            <w:r>
-              <w:t>${</w:t>
-            </w:r>
-            <w:r>
-              <w:rPr>
-                <w:lang w:val="en-ID"/>
-              </w:rPr>
-              <w:t>KEBUTUHAN_EDUKASI_</w:t>
-            </w:r>
-            <w:r>
-              <w:rPr>
-                <w:lang w:val="en-ID"/>
-              </w:rPr>
-              <w:t>3</w:t>
-            </w:r>
-            <w:r>
-              <w:rPr>
-                <w:lang w:val="en-ID"/>
-              </w:rPr>
-              <w:t>}</w:t>
+              <w:t>SKRINING NYERI</w:t>
             </w:r>
           </w:p>
         </w:tc>
@@ -1739,6 +1405,42 @@
             <w:pPr>
               <w:rPr>
                 <w:sz w:val="17"/>
+                <w:lang w:val="en-ID"/>
+              </w:rPr>
+            </w:pPr>
+            <w:r>
+              <w:rPr>
+                <w:sz w:val="17"/>
+              </w:rPr>
+              <w:t>${</w:t>
+            </w:r>
+            <w:r>
+              <w:rPr>
+                <w:sz w:val="17"/>
+                <w:lang w:val="en-ID"/>
+              </w:rPr>
+              <w:t>SKRINING_NYERI</w:t>
+            </w:r>
+            <w:r>
+              <w:rPr>
+                <w:sz w:val="17"/>
+                <w:lang w:val="en-ID"/>
+              </w:rPr>
+              <w:t>}</w:t>
+            </w:r>
+          </w:p>
+        </w:tc>
+      </w:tr>
+      <w:tr>
+        <w:tc>
+          <w:tcPr>
+            <w:tcW w:w="11307" w:type="dxa"/>
+            <w:gridSpan w:val="3"/>
+          </w:tcPr>
+          <w:p>
+            <w:pPr>
+              <w:rPr>
+                <w:sz w:val="17"/>
               </w:rPr>
             </w:pPr>
             <w:r>
@@ -1748,7 +1450,172 @@
                 <w:sz w:val="20"/>
                 <w:szCs w:val="20"/>
               </w:rPr>
-              <w:t>MASALAH KEPERAWATAN</w:t>
+              <w:t>SKRINING RISIKO JATUH</w:t>
+            </w:r>
+          </w:p>
+        </w:tc>
+      </w:tr>
+      <w:tr>
+        <w:tc>
+          <w:tcPr>
+            <w:tcW w:w="11307" w:type="dxa"/>
+            <w:gridSpan w:val="3"/>
+          </w:tcPr>
+          <w:p>
+            <w:pPr>
+              <w:rPr>
+                <w:lang w:val="en-ID"/>
+              </w:rPr>
+            </w:pPr>
+            <w:r>
+              <w:t>${</w:t>
+            </w:r>
+            <w:r>
+              <w:rPr>
+                <w:lang w:val="en-ID"/>
+              </w:rPr>
+              <w:t>SKRINING_RISIKO_JATUH</w:t>
+            </w:r>
+            <w:r>
+              <w:rPr>
+                <w:lang w:val="en-ID"/>
+              </w:rPr>
+              <w:t>}</w:t>
+            </w:r>
+          </w:p>
+        </w:tc>
+      </w:tr>
+      <w:tr>
+        <w:tc>
+          <w:tcPr>
+            <w:tcW w:w="11307" w:type="dxa"/>
+            <w:gridSpan w:val="3"/>
+          </w:tcPr>
+          <w:p>
+            <w:pPr>
+              <w:rPr>
+                <w:sz w:val="17"/>
+              </w:rPr>
+            </w:pPr>
+            <w:r>
+              <w:rPr>
+                <w:b/>
+                <w:bCs/>
+                <w:sz w:val="20"/>
+                <w:szCs w:val="20"/>
+              </w:rPr>
+              <w:t>SKRINING GIZI</w:t>
+            </w:r>
+          </w:p>
+        </w:tc>
+      </w:tr>
+      <w:tr>
+        <w:trPr>
+          <w:trHeight w:val="70"/>
+        </w:trPr>
+        <w:tc>
+          <w:tcPr>
+            <w:tcW w:w="11307" w:type="dxa"/>
+            <w:gridSpan w:val="3"/>
+          </w:tcPr>
+          <w:p>
+            <w:pPr>
+              <w:rPr>
+                <w:lang w:val="en-ID"/>
+              </w:rPr>
+            </w:pPr>
+            <w:r>
+              <w:t>${</w:t>
+            </w:r>
+            <w:r>
+              <w:rPr>
+                <w:lang w:val="en-ID"/>
+              </w:rPr>
+              <w:t>SKRINING_</w:t>
+            </w:r>
+            <w:r>
+              <w:rPr>
+                <w:lang w:val="en-ID"/>
+              </w:rPr>
+              <w:t>GIZI}</w:t>
+            </w:r>
+          </w:p>
+        </w:tc>
+      </w:tr>
+      <w:tr>
+        <w:tc>
+          <w:tcPr>
+            <w:tcW w:w="11307" w:type="dxa"/>
+            <w:gridSpan w:val="3"/>
+          </w:tcPr>
+          <w:p>
+            <w:pPr>
+              <w:rPr>
+                <w:sz w:val="17"/>
+              </w:rPr>
+            </w:pPr>
+            <w:r>
+              <w:rPr>
+                <w:b/>
+                <w:bCs/>
+                <w:sz w:val="20"/>
+                <w:szCs w:val="20"/>
+              </w:rPr>
+              <w:t>EDUKASI</w:t>
+            </w:r>
+          </w:p>
+        </w:tc>
+      </w:tr>
+      <w:tr>
+        <w:tc>
+          <w:tcPr>
+            <w:tcW w:w="11307" w:type="dxa"/>
+            <w:gridSpan w:val="3"/>
+          </w:tcPr>
+          <w:p>
+            <w:pPr>
+              <w:rPr>
+                <w:b/>
+                <w:bCs/>
+                <w:sz w:val="20"/>
+                <w:szCs w:val="20"/>
+              </w:rPr>
+            </w:pPr>
+            <w:r>
+              <w:t>${KESEDIAAN_DAN_HAMBATAN</w:t>
+            </w:r>
+            <w:r>
+              <w:rPr>
+                <w:lang w:val="en-ID"/>
+              </w:rPr>
+              <w:t>}</w:t>
+            </w:r>
+          </w:p>
+        </w:tc>
+      </w:tr>
+      <w:tr>
+        <w:tc>
+          <w:tcPr>
+            <w:tcW w:w="11307" w:type="dxa"/>
+            <w:gridSpan w:val="3"/>
+          </w:tcPr>
+          <w:p>
+            <w:pPr>
+              <w:rPr>
+                <w:b/>
+                <w:bCs/>
+                <w:sz w:val="20"/>
+                <w:szCs w:val="20"/>
+              </w:rPr>
+            </w:pPr>
+            <w:r>
+              <w:rPr>
+                <w:b/>
+                <w:bCs/>
+                <w:sz w:val="20"/>
+                <w:szCs w:val="20"/>
+              </w:rPr>
+              <w:t>Kebutuhan Edukasi</w:t>
             </w:r>
           </w:p>
         </w:tc>
@@ -1771,19 +1638,7 @@
               <w:rPr>
                 <w:lang w:val="en-ID"/>
               </w:rPr>
-              <w:t>MASALAH_KEPERAWATAN</w:t>
-            </w:r>
-            <w:r>
-              <w:rPr>
-                <w:lang w:val="en-ID"/>
-              </w:rPr>
-              <w:t>_1</w:t>
-            </w:r>
-            <w:r>
-              <w:rPr>
-                <w:lang w:val="en-ID"/>
-              </w:rPr>
-              <w:t>}</w:t>
+              <w:t>KEBUTUHAN_EDUKASI_1}</w:t>
             </w:r>
           </w:p>
         </w:tc>
@@ -1804,19 +1659,7 @@
               <w:rPr>
                 <w:lang w:val="en-ID"/>
               </w:rPr>
-              <w:t>MASALAH_KEPERAWATAN_</w:t>
-            </w:r>
-            <w:r>
-              <w:rPr>
-                <w:lang w:val="en-ID"/>
-              </w:rPr>
-              <w:t>2</w:t>
-            </w:r>
-            <w:r>
-              <w:rPr>
-                <w:lang w:val="en-ID"/>
-              </w:rPr>
-              <w:t>}</w:t>
+              <w:t>KEBUTUHAN_EDUKASI_2}</w:t>
             </w:r>
           </w:p>
         </w:tc>
@@ -1837,19 +1680,96 @@
               <w:rPr>
                 <w:lang w:val="en-ID"/>
               </w:rPr>
-              <w:t>MASALAH_KEPERAWATAN_</w:t>
-            </w:r>
-            <w:r>
+              <w:t>KEBUTUHAN_EDUKASI_3}</w:t>
+            </w:r>
+          </w:p>
+        </w:tc>
+      </w:tr>
+      <w:tr>
+        <w:tc>
+          <w:tcPr>
+            <w:tcW w:w="11307" w:type="dxa"/>
+            <w:gridSpan w:val="3"/>
+          </w:tcPr>
+          <w:p>
+            <w:pPr>
+              <w:rPr>
+                <w:sz w:val="17"/>
+              </w:rPr>
+            </w:pPr>
+            <w:r>
+              <w:rPr>
+                <w:b/>
+                <w:bCs/>
+                <w:sz w:val="20"/>
+                <w:szCs w:val="20"/>
+              </w:rPr>
+              <w:t>MASALAH KEPERAWATAN</w:t>
+            </w:r>
+          </w:p>
+        </w:tc>
+      </w:tr>
+      <w:tr>
+        <w:tc>
+          <w:tcPr>
+            <w:tcW w:w="3769" w:type="dxa"/>
+          </w:tcPr>
+          <w:p>
+            <w:pPr>
               <w:rPr>
                 <w:lang w:val="en-ID"/>
               </w:rPr>
-              <w:t>3</w:t>
+            </w:pPr>
+            <w:r>
+              <w:t>${</w:t>
             </w:r>
             <w:r>
               <w:rPr>
                 <w:lang w:val="en-ID"/>
               </w:rPr>
-              <w:t>}</w:t>
+              <w:t>MASALAH_KEPERAWATAN_1}</w:t>
+            </w:r>
+          </w:p>
+        </w:tc>
+        <w:tc>
+          <w:tcPr>
+            <w:tcW w:w="3769" w:type="dxa"/>
+          </w:tcPr>
+          <w:p>
+            <w:pPr>
+              <w:rPr>
+                <w:lang w:val="en-ID"/>
+              </w:rPr>
+            </w:pPr>
+            <w:r>
+              <w:t>${</w:t>
+            </w:r>
+            <w:r>
+              <w:rPr>
+                <w:lang w:val="en-ID"/>
+              </w:rPr>
+              <w:t>MASALAH_KEPERAWATAN_2}</w:t>
+            </w:r>
+          </w:p>
+        </w:tc>
+        <w:tc>
+          <w:tcPr>
+            <w:tcW w:w="3769" w:type="dxa"/>
+          </w:tcPr>
+          <w:p>
+            <w:pPr>
+              <w:rPr>
+                <w:lang w:val="en-ID"/>
+              </w:rPr>
+            </w:pPr>
+            <w:r>
+              <w:t>${</w:t>
+            </w:r>
+            <w:r>
+              <w:rPr>
+                <w:lang w:val="en-ID"/>
+              </w:rPr>
+              <w:t>MASALAH_KEPERAWATAN_3}</w:t>
             </w:r>
           </w:p>
         </w:tc>
@@ -1963,13 +1883,7 @@
               <w:rPr>
                 <w:lang w:val="en-ID"/>
               </w:rPr>
-              <w:t>TINDAKAN</w:t>
-            </w:r>
-            <w:r>
-              <w:rPr>
-                <w:lang w:val="en-ID"/>
-              </w:rPr>
-              <w:t>}</w:t>
+              <w:t>TINDAKAN}</w:t>
             </w:r>
           </w:p>
         </w:tc>
@@ -1991,13 +1905,7 @@
               <w:rPr>
                 <w:lang w:val="en-ID"/>
               </w:rPr>
-              <w:t>RAWAT_LUKA</w:t>
-            </w:r>
-            <w:r>
-              <w:rPr>
-                <w:lang w:val="en-ID"/>
-              </w:rPr>
-              <w:t>}</w:t>
+              <w:t>RAWAT_LUKA}</w:t>
             </w:r>
           </w:p>
         </w:tc>
@@ -2085,13 +1993,7 @@
               <w:rPr>
                 <w:lang w:val="en-ID"/>
               </w:rPr>
-              <w:t>TERAPI</w:t>
-            </w:r>
-            <w:r>
-              <w:rPr>
-                <w:lang w:val="en-ID"/>
-              </w:rPr>
-              <w:t>}</w:t>
+              <w:t>TERAPI}</w:t>
             </w:r>
           </w:p>
         </w:tc>
@@ -2265,7 +2167,7 @@
                       <v:stroke joinstyle="miter"/>
                       <v:path gradientshapeok="t" o:connecttype="rect"/>
                     </v:shapetype>
-                    <v:shape id="Text Box 971992564" o:spid="_x0000_s1026" type="#_x0000_t202" style="position:absolute;left:0;text-align:left;margin-left:40pt;margin-top:10.05pt;width:188.15pt;height:91.85pt;z-index:251656192;visibility:visible;mso-wrap-style:square;mso-width-percent:0;mso-height-percent:0;mso-wrap-distance-left:9pt;mso-wrap-distance-top:0;mso-wrap-distance-right:9pt;mso-wrap-distance-bottom:0;mso-position-horizontal:absolute;mso-position-horizontal-relative:text;mso-position-vertical:absolute;mso-position-vertical-relative:text;mso-width-percent:0;mso-height-percent:0;mso-width-relative:margin;mso-height-relative:margin;v-text-anchor:middle" o:gfxdata="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" filled="f" stroked="f" strokeweight=".5pt">
+                    <v:shape id="Text Box 971992564" o:spid="_x0000_s1026" type="#_x0000_t202" style="position:absolute;left:0;text-align:left;margin-left:40pt;margin-top:10.05pt;width:188.15pt;height:91.85pt;z-index:251656192;visibility:visible;mso-wrap-style:square;mso-width-percent:0;mso-height-percent:0;mso-wrap-distance-left:9pt;mso-wrap-distance-top:0;mso-wrap-distance-right:9pt;mso-wrap-distance-bottom:0;mso-position-horizontal:absolute;mso-position-horizontal-relative:text;mso-position-vertical:absolute;mso-position-vertical-relative:text;mso-width-percent:0;mso-height-percent:0;mso-width-relative:margin;mso-height-relative:margin;v-text-anchor:middle" o:gfxdata="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" filled="f" stroked="f" strokeweight=".5pt">
                       <v:textbox>
                         <w:txbxContent>
                           <w:p>
@@ -2544,7 +2446,7 @@
                 </mc:Choice>
                 <mc:Fallback>
                   <w:pict>
-                    <v:shape w14:anchorId="1B7476A5" id="Text Box 7" o:spid="_x0000_s1027" type="#_x0000_t202" style="position:absolute;left:0;text-align:left;margin-left:40pt;margin-top:10.05pt;width:188.15pt;height:91.85pt;z-index:251654144;visibility:visible;mso-wrap-style:square;mso-width-percent:0;mso-height-percent:0;mso-wrap-distance-left:9pt;mso-wrap-distance-top:0;mso-wrap-distance-right:9pt;mso-wrap-distance-bottom:0;mso-position-horizontal:absolute;mso-position-horizontal-relative:text;mso-position-vertical:absolute;mso-position-vertical-relative:text;mso-width-percent:0;mso-height-percent:0;mso-width-relative:margin;mso-height-relative:margin;v-text-anchor:middle" o:gfxdata="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" filled="f" stroked="f" strokeweight=".5pt">
+                    <v:shape w14:anchorId="1B7476A5" id="Text Box 7" o:spid="_x0000_s1027" type="#_x0000_t202" style="position:absolute;left:0;text-align:left;margin-left:40pt;margin-top:10.05pt;width:188.15pt;height:91.85pt;z-index:251654144;visibility:visible;mso-wrap-style:square;mso-width-percent:0;mso-height-percent:0;mso-wrap-distance-left:9pt;mso-wrap-distance-top:0;mso-wrap-distance-right:9pt;mso-wrap-distance-bottom:0;mso-position-horizontal:absolute;mso-position-horizontal-relative:text;mso-position-vertical:absolute;mso-position-vertical-relative:text;mso-width-percent:0;mso-height-percent:0;mso-width-relative:margin;mso-height-relative:margin;v-text-anchor:middle" o:gfxdata="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" filled="f" stroked="f" strokeweight=".5pt">
                       <v:textbox>
                         <w:txbxContent>
                           <w:p>
@@ -2748,7 +2650,7 @@
 </file>
 
 <file path=word/endnotes.xml><?xml version="1.0" encoding="utf-8"?>
-<w:endnotes xmlns:wpc="http://schemas.microsoft.com/office/word/2010/wordprocessingCanvas" xmlns:cx="http://schemas.microsoft.com/office/drawing/2014/chartex" xmlns:cx1="http://schemas.microsoft.com/office/drawing/2015/9/8/chartex" xmlns:cx2="http://schemas.microsoft.com/office/drawing/2015/10/21/chartex" xmlns:cx3="http://schemas.microsoft.com/office/drawing/2016/5/9/chartex" xmlns:cx4="http://schemas.microsoft.com/office/drawing/2016/5/10/chartex" xmlns:cx5="http://schemas.microsoft.com/office/drawing/2016/5/11/chartex" xmlns:cx6="http://schemas.microsoft.com/office/drawing/2016/5/12/chartex" xmlns:cx7="http://schemas.microsoft.com/office/drawing/2016/5/13/chartex" xmlns:cx8="http://schemas.microsoft.com/office/drawing/2016/5/14/chartex" xmlns:mc="http://schemas.openxmlformats.org/markup-compatibility/2006" xmlns:aink="http://schemas.microsoft.com/office/drawing/2016/ink" xmlns:am3d="http://schemas.microsoft.com/office/drawing/2017/model3d" xmlns:o="urn:schemas-microsoft-com:office:office" xmlns:oel="http://schemas.microsoft.com/office/2019/extlst" xmlns:r="http://schemas.openxmlformats.org/officeDocument/2006/relationships" xmlns:m="http://schemas.openxmlformats.org/officeDocument/2006/math" xmlns:v="urn:schemas-microsoft-com:vml" xmlns:wp14="http://schemas.microsoft.com/office/word/2010/wordprocessingDrawing" xmlns:wp="http://schemas.openxmlformats.org/drawingml/2006/wordprocessingDrawing" xmlns:w10="urn:schemas-microsoft-com:office:word" xmlns:w="http://schemas.openxmlformats.org/wordprocessingml/2006/main" xmlns:w14="http://schemas.microsoft.com/office/word/2010/wordml" xmlns:w15="http://schemas.microsoft.com/office/word/2012/wordml" xmlns:w16cex="http://schemas.microsoft.com/office/word/2018/wordml/cex" xmlns:w16cid="http://schemas.microsoft.com/office/word/2016/wordml/cid" xmlns:w16="http://schemas.microsoft.com/office/word/2018/wordml" xmlns:w16du="http://schemas.microsoft.com/office/word/2023/wordml/word16du" xmlns:w16sdtdh="http://schemas.microsoft.com/office/word/2020/wordml/sdtdatahash" xmlns:w16sdtfl="http://schemas.microsoft.com/office/word/2024/wordml/sdtformatlock" xmlns:w16se="http://schemas.microsoft.com/office/word/2015/wordml/symex" xmlns:wpg="http://schemas.microsoft.com/office/word/2010/wordprocessingGroup" xmlns:wpi="http://schemas.microsoft.com/office/word/2010/wordprocessingInk" xmlns:wne="http://schemas.microsoft.com/office/word/2006/wordml" xmlns:wps="http://schemas.microsoft.com/office/word/2010/wordprocessingShape" mc:Ignorable="w14 w15 w16se w16cid w16 w16cex w16sdtdh w16sdtfl w16du wp14">
+<w:endnotes xmlns:wpc="http://schemas.microsoft.com/office/word/2010/wordprocessingCanvas" xmlns:cx="http://schemas.microsoft.com/office/drawing/2014/chartex" xmlns:cx1="http://schemas.microsoft.com/office/drawing/2015/9/8/chartex" xmlns:cx2="http://schemas.microsoft.com/office/drawing/2015/10/21/chartex" xmlns:cx3="http://schemas.microsoft.com/office/drawing/2016/5/9/chartex" xmlns:cx4="http://schemas.microsoft.com/office/drawing/2016/5/10/chartex" xmlns:cx5="http://schemas.microsoft.com/office/drawing/2016/5/11/chartex" xmlns:cx6="http://schemas.microsoft.com/office/drawing/2016/5/12/chartex" xmlns:cx7="http://schemas.microsoft.com/office/drawing/2016/5/13/chartex" xmlns:cx8="http://schemas.microsoft.com/office/drawing/2016/5/14/chartex" xmlns:mc="http://schemas.openxmlformats.org/markup-compatibility/2006" xmlns:aink="http://schemas.microsoft.com/office/drawing/2016/ink" xmlns:am3d="http://schemas.microsoft.com/office/drawing/2017/model3d" xmlns:o="urn:schemas-microsoft-com:office:office" xmlns:r="http://schemas.openxmlformats.org/officeDocument/2006/relationships" xmlns:m="http://schemas.openxmlformats.org/officeDocument/2006/math" xmlns:v="urn:schemas-microsoft-com:vml" xmlns:wp14="http://schemas.microsoft.com/office/word/2010/wordprocessingDrawing" xmlns:wp="http://schemas.openxmlformats.org/drawingml/2006/wordprocessingDrawing" xmlns:w10="urn:schemas-microsoft-com:office:word" xmlns:w="http://schemas.openxmlformats.org/wordprocessingml/2006/main" xmlns:w14="http://schemas.microsoft.com/office/word/2010/wordml" xmlns:w15="http://schemas.microsoft.com/office/word/2012/wordml" xmlns:w16cex="http://schemas.microsoft.com/office/word/2018/wordml/cex" xmlns:w16cid="http://schemas.microsoft.com/office/word/2016/wordml/cid" xmlns:w16="http://schemas.microsoft.com/office/word/2018/wordml" xmlns:w16sdtdh="http://schemas.microsoft.com/office/word/2020/wordml/sdtdatahash" xmlns:w16se="http://schemas.microsoft.com/office/word/2015/wordml/symex" xmlns:wpg="http://schemas.microsoft.com/office/word/2010/wordprocessingGroup" xmlns:wpi="http://schemas.microsoft.com/office/word/2010/wordprocessingInk" xmlns:wne="http://schemas.microsoft.com/office/word/2006/wordml" xmlns:wps="http://schemas.microsoft.com/office/word/2010/wordprocessingShape" mc:Ignorable="w14 w15 w16se w16cid w16 w16cex w16sdtdh wp14">
   <w:endnote w:type="separator" w:id="-1">
     <w:p>
       <w:pPr>
@@ -2773,7 +2675,7 @@
 </file>
 
 <file path=word/footer1.xml><?xml version="1.0" encoding="utf-8"?>
-<w:ftr xmlns:wpc="http://schemas.microsoft.com/office/word/2010/wordprocessingCanvas" xmlns:cx="http://schemas.microsoft.com/office/drawing/2014/chartex" xmlns:cx1="http://schemas.microsoft.com/office/drawing/2015/9/8/chartex" xmlns:cx2="http://schemas.microsoft.com/office/drawing/2015/10/21/chartex" xmlns:cx3="http://schemas.microsoft.com/office/drawing/2016/5/9/chartex" xmlns:cx4="http://schemas.microsoft.com/office/drawing/2016/5/10/chartex" xmlns:cx5="http://schemas.microsoft.com/office/drawing/2016/5/11/chartex" xmlns:cx6="http://schemas.microsoft.com/office/drawing/2016/5/12/chartex" xmlns:cx7="http://schemas.microsoft.com/office/drawing/2016/5/13/chartex" xmlns:cx8="http://schemas.microsoft.com/office/drawing/2016/5/14/chartex" xmlns:mc="http://schemas.openxmlformats.org/markup-compatibility/2006" xmlns:aink="http://schemas.microsoft.com/office/drawing/2016/ink" xmlns:am3d="http://schemas.microsoft.com/office/drawing/2017/model3d" xmlns:o="urn:schemas-microsoft-com:office:office" xmlns:oel="http://schemas.microsoft.com/office/2019/extlst" xmlns:r="http://schemas.openxmlformats.org/officeDocument/2006/relationships" xmlns:m="http://schemas.openxmlformats.org/officeDocument/2006/math" xmlns:v="urn:schemas-microsoft-com:vml" xmlns:wp14="http://schemas.microsoft.com/office/word/2010/wordprocessingDrawing" xmlns:wp="http://schemas.openxmlformats.org/drawingml/2006/wordprocessingDrawing" xmlns:w10="urn:schemas-microsoft-com:office:word" xmlns:w="http://schemas.openxmlformats.org/wordprocessingml/2006/main" xmlns:w14="http://schemas.microsoft.com/office/word/2010/wordml" xmlns:w15="http://schemas.microsoft.com/office/word/2012/wordml" xmlns:w16cex="http://schemas.microsoft.com/office/word/2018/wordml/cex" xmlns:w16cid="http://schemas.microsoft.com/office/word/2016/wordml/cid" xmlns:w16="http://schemas.microsoft.com/office/word/2018/wordml" xmlns:w16du="http://schemas.microsoft.com/office/word/2023/wordml/word16du" xmlns:w16sdtdh="http://schemas.microsoft.com/office/word/2020/wordml/sdtdatahash" xmlns:w16sdtfl="http://schemas.microsoft.com/office/word/2024/wordml/sdtformatlock" xmlns:w16se="http://schemas.microsoft.com/office/word/2015/wordml/symex" xmlns:wpg="http://schemas.microsoft.com/office/word/2010/wordprocessingGroup" xmlns:wpi="http://schemas.microsoft.com/office/word/2010/wordprocessingInk" xmlns:wne="http://schemas.microsoft.com/office/word/2006/wordml" xmlns:wps="http://schemas.microsoft.com/office/word/2010/wordprocessingShape" mc:Ignorable="w14 w15 w16se w16cid w16 w16cex w16sdtdh w16sdtfl w16du wp14">
+<w:ftr xmlns:wpc="http://schemas.microsoft.com/office/word/2010/wordprocessingCanvas" xmlns:cx="http://schemas.microsoft.com/office/drawing/2014/chartex" xmlns:cx1="http://schemas.microsoft.com/office/drawing/2015/9/8/chartex" xmlns:cx2="http://schemas.microsoft.com/office/drawing/2015/10/21/chartex" xmlns:cx3="http://schemas.microsoft.com/office/drawing/2016/5/9/chartex" xmlns:cx4="http://schemas.microsoft.com/office/drawing/2016/5/10/chartex" xmlns:cx5="http://schemas.microsoft.com/office/drawing/2016/5/11/chartex" xmlns:cx6="http://schemas.microsoft.com/office/drawing/2016/5/12/chartex" xmlns:cx7="http://schemas.microsoft.com/office/drawing/2016/5/13/chartex" xmlns:cx8="http://schemas.microsoft.com/office/drawing/2016/5/14/chartex" xmlns:mc="http://schemas.openxmlformats.org/markup-compatibility/2006" xmlns:aink="http://schemas.microsoft.com/office/drawing/2016/ink" xmlns:am3d="http://schemas.microsoft.com/office/drawing/2017/model3d" xmlns:o="urn:schemas-microsoft-com:office:office" xmlns:r="http://schemas.openxmlformats.org/officeDocument/2006/relationships" xmlns:m="http://schemas.openxmlformats.org/officeDocument/2006/math" xmlns:v="urn:schemas-microsoft-com:vml" xmlns:wp14="http://schemas.microsoft.com/office/word/2010/wordprocessingDrawing" xmlns:wp="http://schemas.openxmlformats.org/drawingml/2006/wordprocessingDrawing" xmlns:w10="urn:schemas-microsoft-com:office:word" xmlns:w="http://schemas.openxmlformats.org/wordprocessingml/2006/main" xmlns:w14="http://schemas.microsoft.com/office/word/2010/wordml" xmlns:w15="http://schemas.microsoft.com/office/word/2012/wordml" xmlns:w16cex="http://schemas.microsoft.com/office/word/2018/wordml/cex" xmlns:w16cid="http://schemas.microsoft.com/office/word/2016/wordml/cid" xmlns:w16="http://schemas.microsoft.com/office/word/2018/wordml" xmlns:w16sdtdh="http://schemas.microsoft.com/office/word/2020/wordml/sdtdatahash" xmlns:w16se="http://schemas.microsoft.com/office/word/2015/wordml/symex" xmlns:wpg="http://schemas.microsoft.com/office/word/2010/wordprocessingGroup" xmlns:wpi="http://schemas.microsoft.com/office/word/2010/wordprocessingInk" xmlns:wne="http://schemas.microsoft.com/office/word/2006/wordml" xmlns:wps="http://schemas.microsoft.com/office/word/2010/wordprocessingShape" mc:Ignorable="w14 w15 w16se w16cid w16 w16cex w16sdtdh wp14">
   <w:p>
     <w:pPr>
       <w:pStyle w:val="Footer"/>
@@ -2817,7 +2719,7 @@
 </file>
 
 <file path=word/footnotes.xml><?xml version="1.0" encoding="utf-8"?>
-<w:footnotes xmlns:wpc="http://schemas.microsoft.com/office/word/2010/wordprocessingCanvas" xmlns:cx="http://schemas.microsoft.com/office/drawing/2014/chartex" xmlns:cx1="http://schemas.microsoft.com/office/drawing/2015/9/8/chartex" xmlns:cx2="http://schemas.microsoft.com/office/drawing/2015/10/21/chartex" xmlns:cx3="http://schemas.microsoft.com/office/drawing/2016/5/9/chartex" xmlns:cx4="http://schemas.microsoft.com/office/drawing/2016/5/10/chartex" xmlns:cx5="http://schemas.microsoft.com/office/drawing/2016/5/11/chartex" xmlns:cx6="http://schemas.microsoft.com/office/drawing/2016/5/12/chartex" xmlns:cx7="http://schemas.microsoft.com/office/drawing/2016/5/13/chartex" xmlns:cx8="http://schemas.microsoft.com/office/drawing/2016/5/14/chartex" xmlns:mc="http://schemas.openxmlformats.org/markup-compatibility/2006" xmlns:aink="http://schemas.microsoft.com/office/drawing/2016/ink" xmlns:am3d="http://schemas.microsoft.com/office/drawing/2017/model3d" xmlns:o="urn:schemas-microsoft-com:office:office" xmlns:oel="http://schemas.microsoft.com/office/2019/extlst" xmlns:r="http://schemas.openxmlformats.org/officeDocument/2006/relationships" xmlns:m="http://schemas.openxmlformats.org/officeDocument/2006/math" xmlns:v="urn:schemas-microsoft-com:vml" xmlns:wp14="http://schemas.microsoft.com/office/word/2010/wordprocessingDrawing" xmlns:wp="http://schemas.openxmlformats.org/drawingml/2006/wordprocessingDrawing" xmlns:w10="urn:schemas-microsoft-com:office:word" xmlns:w="http://schemas.openxmlformats.org/wordprocessingml/2006/main" xmlns:w14="http://schemas.microsoft.com/office/word/2010/wordml" xmlns:w15="http://schemas.microsoft.com/office/word/2012/wordml" xmlns:w16cex="http://schemas.microsoft.com/office/word/2018/wordml/cex" xmlns:w16cid="http://schemas.microsoft.com/office/word/2016/wordml/cid" xmlns:w16="http://schemas.microsoft.com/office/word/2018/wordml" xmlns:w16du="http://schemas.microsoft.com/office/word/2023/wordml/word16du" xmlns:w16sdtdh="http://schemas.microsoft.com/office/word/2020/wordml/sdtdatahash" xmlns:w16sdtfl="http://schemas.microsoft.com/office/word/2024/wordml/sdtformatlock" xmlns:w16se="http://schemas.microsoft.com/office/word/2015/wordml/symex" xmlns:wpg="http://schemas.microsoft.com/office/word/2010/wordprocessingGroup" xmlns:wpi="http://schemas.microsoft.com/office/word/2010/wordprocessingInk" xmlns:wne="http://schemas.microsoft.com/office/word/2006/wordml" xmlns:wps="http://schemas.microsoft.com/office/word/2010/wordprocessingShape" mc:Ignorable="w14 w15 w16se w16cid w16 w16cex w16sdtdh w16sdtfl w16du wp14">
+<w:footnotes xmlns:wpc="http://schemas.microsoft.com/office/word/2010/wordprocessingCanvas" xmlns:cx="http://schemas.microsoft.com/office/drawing/2014/chartex" xmlns:cx1="http://schemas.microsoft.com/office/drawing/2015/9/8/chartex" xmlns:cx2="http://schemas.microsoft.com/office/drawing/2015/10/21/chartex" xmlns:cx3="http://schemas.microsoft.com/office/drawing/2016/5/9/chartex" xmlns:cx4="http://schemas.microsoft.com/office/drawing/2016/5/10/chartex" xmlns:cx5="http://schemas.microsoft.com/office/drawing/2016/5/11/chartex" xmlns:cx6="http://schemas.microsoft.com/office/drawing/2016/5/12/chartex" xmlns:cx7="http://schemas.microsoft.com/office/drawing/2016/5/13/chartex" xmlns:cx8="http://schemas.microsoft.com/office/drawing/2016/5/14/chartex" xmlns:mc="http://schemas.openxmlformats.org/markup-compatibility/2006" xmlns:aink="http://schemas.microsoft.com/office/drawing/2016/ink" xmlns:am3d="http://schemas.microsoft.com/office/drawing/2017/model3d" xmlns:o="urn:schemas-microsoft-com:office:office" xmlns:r="http://schemas.openxmlformats.org/officeDocument/2006/relationships" xmlns:m="http://schemas.openxmlformats.org/officeDocument/2006/math" xmlns:v="urn:schemas-microsoft-com:vml" xmlns:wp14="http://schemas.microsoft.com/office/word/2010/wordprocessingDrawing" xmlns:wp="http://schemas.openxmlformats.org/drawingml/2006/wordprocessingDrawing" xmlns:w10="urn:schemas-microsoft-com:office:word" xmlns:w="http://schemas.openxmlformats.org/wordprocessingml/2006/main" xmlns:w14="http://schemas.microsoft.com/office/word/2010/wordml" xmlns:w15="http://schemas.microsoft.com/office/word/2012/wordml" xmlns:w16cex="http://schemas.microsoft.com/office/word/2018/wordml/cex" xmlns:w16cid="http://schemas.microsoft.com/office/word/2016/wordml/cid" xmlns:w16="http://schemas.microsoft.com/office/word/2018/wordml" xmlns:w16sdtdh="http://schemas.microsoft.com/office/word/2020/wordml/sdtdatahash" xmlns:w16se="http://schemas.microsoft.com/office/word/2015/wordml/symex" xmlns:wpg="http://schemas.microsoft.com/office/word/2010/wordprocessingGroup" xmlns:wpi="http://schemas.microsoft.com/office/word/2010/wordprocessingInk" xmlns:wne="http://schemas.microsoft.com/office/word/2006/wordml" xmlns:wps="http://schemas.microsoft.com/office/word/2010/wordprocessingShape" mc:Ignorable="w14 w15 w16se w16cid w16 w16cex w16sdtdh wp14">
   <w:footnote w:type="separator" w:id="-1">
     <w:p>
       <w:pPr>
@@ -2842,7 +2744,7 @@
 </file>
 
 <file path=word/numbering.xml><?xml version="1.0" encoding="utf-8"?>
-<w:numbering xmlns:wpc="http://schemas.microsoft.com/office/word/2010/wordprocessingCanvas" xmlns:cx="http://schemas.microsoft.com/office/drawing/2014/chartex" xmlns:cx1="http://schemas.microsoft.com/office/drawing/2015/9/8/chartex" xmlns:cx2="http://schemas.microsoft.com/office/drawing/2015/10/21/chartex" xmlns:cx3="http://schemas.microsoft.com/office/drawing/2016/5/9/chartex" xmlns:cx4="http://schemas.microsoft.com/office/drawing/2016/5/10/chartex" xmlns:cx5="http://schemas.microsoft.com/office/drawing/2016/5/11/chartex" xmlns:cx6="http://schemas.microsoft.com/office/drawing/2016/5/12/chartex" xmlns:cx7="http://schemas.microsoft.com/office/drawing/2016/5/13/chartex" xmlns:cx8="http://schemas.microsoft.com/office/drawing/2016/5/14/chartex" xmlns:mc="http://schemas.openxmlformats.org/markup-compatibility/2006" xmlns:aink="http://schemas.microsoft.com/office/drawing/2016/ink" xmlns:am3d="http://schemas.microsoft.com/office/drawing/2017/model3d" xmlns:o="urn:schemas-microsoft-com:office:office" xmlns:oel="http://schemas.microsoft.com/office/2019/extlst" xmlns:r="http://schemas.openxmlformats.org/officeDocument/2006/relationships" xmlns:m="http://schemas.openxmlformats.org/officeDocument/2006/math" xmlns:v="urn:schemas-microsoft-com:vml" xmlns:wp14="http://schemas.microsoft.com/office/word/2010/wordprocessingDrawing" xmlns:wp="http://schemas.openxmlformats.org/drawingml/2006/wordprocessingDrawing" xmlns:w10="urn:schemas-microsoft-com:office:word" xmlns:w="http://schemas.openxmlformats.org/wordprocessingml/2006/main" xmlns:w14="http://schemas.microsoft.com/office/word/2010/wordml" xmlns:w15="http://schemas.microsoft.com/office/word/2012/wordml" xmlns:w16cex="http://schemas.microsoft.com/office/word/2018/wordml/cex" xmlns:w16cid="http://schemas.microsoft.com/office/word/2016/wordml/cid" xmlns:w16="http://schemas.microsoft.com/office/word/2018/wordml" xmlns:w16du="http://schemas.microsoft.com/office/word/2023/wordml/word16du" xmlns:w16sdtdh="http://schemas.microsoft.com/office/word/2020/wordml/sdtdatahash" xmlns:w16sdtfl="http://schemas.microsoft.com/office/word/2024/wordml/sdtformatlock" xmlns:w16se="http://schemas.microsoft.com/office/word/2015/wordml/symex" xmlns:wpg="http://schemas.microsoft.com/office/word/2010/wordprocessingGroup" xmlns:wpi="http://schemas.microsoft.com/office/word/2010/wordprocessingInk" xmlns:wne="http://schemas.microsoft.com/office/word/2006/wordml" xmlns:wps="http://schemas.microsoft.com/office/word/2010/wordprocessingShape" mc:Ignorable="w14 w15 w16se w16cid w16 w16cex w16sdtdh w16sdtfl w16du wp14">
+<w:numbering xmlns:wpc="http://schemas.microsoft.com/office/word/2010/wordprocessingCanvas" xmlns:cx="http://schemas.microsoft.com/office/drawing/2014/chartex" xmlns:cx1="http://schemas.microsoft.com/office/drawing/2015/9/8/chartex" xmlns:cx2="http://schemas.microsoft.com/office/drawing/2015/10/21/chartex" xmlns:cx3="http://schemas.microsoft.com/office/drawing/2016/5/9/chartex" xmlns:cx4="http://schemas.microsoft.com/office/drawing/2016/5/10/chartex" xmlns:cx5="http://schemas.microsoft.com/office/drawing/2016/5/11/chartex" xmlns:cx6="http://schemas.microsoft.com/office/drawing/2016/5/12/chartex" xmlns:cx7="http://schemas.microsoft.com/office/drawing/2016/5/13/chartex" xmlns:cx8="http://schemas.microsoft.com/office/drawing/2016/5/14/chartex" xmlns:mc="http://schemas.openxmlformats.org/markup-compatibility/2006" xmlns:aink="http://schemas.microsoft.com/office/drawing/2016/ink" xmlns:am3d="http://schemas.microsoft.com/office/drawing/2017/model3d" xmlns:o="urn:schemas-microsoft-com:office:office" xmlns:r="http://schemas.openxmlformats.org/officeDocument/2006/relationships" xmlns:m="http://schemas.openxmlformats.org/officeDocument/2006/math" xmlns:v="urn:schemas-microsoft-com:vml" xmlns:wp14="http://schemas.microsoft.com/office/word/2010/wordprocessingDrawing" xmlns:wp="http://schemas.openxmlformats.org/drawingml/2006/wordprocessingDrawing" xmlns:w10="urn:schemas-microsoft-com:office:word" xmlns:w="http://schemas.openxmlformats.org/wordprocessingml/2006/main" xmlns:w14="http://schemas.microsoft.com/office/word/2010/wordml" xmlns:w15="http://schemas.microsoft.com/office/word/2012/wordml" xmlns:w16cex="http://schemas.microsoft.com/office/word/2018/wordml/cex" xmlns:w16cid="http://schemas.microsoft.com/office/word/2016/wordml/cid" xmlns:w16="http://schemas.microsoft.com/office/word/2018/wordml" xmlns:w16sdtdh="http://schemas.microsoft.com/office/word/2020/wordml/sdtdatahash" xmlns:w16se="http://schemas.microsoft.com/office/word/2015/wordml/symex" xmlns:wpg="http://schemas.microsoft.com/office/word/2010/wordprocessingGroup" xmlns:wpi="http://schemas.microsoft.com/office/word/2010/wordprocessingInk" xmlns:wne="http://schemas.microsoft.com/office/word/2006/wordml" xmlns:wps="http://schemas.microsoft.com/office/word/2010/wordprocessingShape" mc:Ignorable="w14 w15 w16se w16cid w16 w16cex w16sdtdh wp14">
   <w:abstractNum w:abstractNumId="0" w15:restartNumberingAfterBreak="0">
     <w:nsid w:val="FFFFFF7C"/>
     <w:multiLevelType w:val="singleLevel"/>
@@ -3014,38 +2916,38 @@
       </w:rPr>
     </w:lvl>
   </w:abstractNum>
-  <w:num w:numId="1" w16cid:durableId="1295601533">
+  <w:num w:numId="1">
     <w:abstractNumId w:val="8"/>
   </w:num>
-  <w:num w:numId="2" w16cid:durableId="1058237018">
+  <w:num w:numId="2">
     <w:abstractNumId w:val="6"/>
   </w:num>
-  <w:num w:numId="3" w16cid:durableId="1728603978">
+  <w:num w:numId="3">
     <w:abstractNumId w:val="5"/>
   </w:num>
-  <w:num w:numId="4" w16cid:durableId="694037153">
+  <w:num w:numId="4">
     <w:abstractNumId w:val="4"/>
   </w:num>
-  <w:num w:numId="5" w16cid:durableId="1379696081">
+  <w:num w:numId="5">
     <w:abstractNumId w:val="7"/>
   </w:num>
-  <w:num w:numId="6" w16cid:durableId="1166475496">
+  <w:num w:numId="6">
     <w:abstractNumId w:val="3"/>
   </w:num>
-  <w:num w:numId="7" w16cid:durableId="1850020969">
+  <w:num w:numId="7">
     <w:abstractNumId w:val="2"/>
   </w:num>
-  <w:num w:numId="8" w16cid:durableId="1585382321">
+  <w:num w:numId="8">
     <w:abstractNumId w:val="1"/>
   </w:num>
-  <w:num w:numId="9" w16cid:durableId="1486776541">
+  <w:num w:numId="9">
     <w:abstractNumId w:val="0"/>
   </w:num>
 </w:numbering>
 </file>
 
 <file path=word/styles.xml><?xml version="1.0" encoding="utf-8"?>
-<w:styles xmlns:mc="http://schemas.openxmlformats.org/markup-compatibility/2006" xmlns:r="http://schemas.openxmlformats.org/officeDocument/2006/relationships" xmlns:w="http://schemas.openxmlformats.org/wordprocessingml/2006/main" xmlns:w14="http://schemas.microsoft.com/office/word/2010/wordml" xmlns:w15="http://schemas.microsoft.com/office/word/2012/wordml" xmlns:w16cex="http://schemas.microsoft.com/office/word/2018/wordml/cex" xmlns:w16cid="http://schemas.microsoft.com/office/word/2016/wordml/cid" xmlns:w16="http://schemas.microsoft.com/office/word/2018/wordml" xmlns:w16du="http://schemas.microsoft.com/office/word/2023/wordml/word16du" xmlns:w16sdtdh="http://schemas.microsoft.com/office/word/2020/wordml/sdtdatahash" xmlns:w16sdtfl="http://schemas.microsoft.com/office/word/2024/wordml/sdtformatlock" xmlns:w16se="http://schemas.microsoft.com/office/word/2015/wordml/symex" mc:Ignorable="w14 w15 w16se w16cid w16 w16cex w16sdtdh w16sdtfl w16du">
+<w:styles xmlns:mc="http://schemas.openxmlformats.org/markup-compatibility/2006" xmlns:r="http://schemas.openxmlformats.org/officeDocument/2006/relationships" xmlns:w="http://schemas.openxmlformats.org/wordprocessingml/2006/main" xmlns:w14="http://schemas.microsoft.com/office/word/2010/wordml" xmlns:w15="http://schemas.microsoft.com/office/word/2012/wordml" xmlns:w16cex="http://schemas.microsoft.com/office/word/2018/wordml/cex" xmlns:w16cid="http://schemas.microsoft.com/office/word/2016/wordml/cid" xmlns:w16="http://schemas.microsoft.com/office/word/2018/wordml" xmlns:w16sdtdh="http://schemas.microsoft.com/office/word/2020/wordml/sdtdatahash" xmlns:w16se="http://schemas.microsoft.com/office/word/2015/wordml/symex" mc:Ignorable="w14 w15 w16se w16cid w16 w16cex w16sdtdh">
   <w:docDefaults>
     <w:rPrDefault>
       <w:rPr>

</xml_diff>